<commit_message>
edited readme and some code to accurately reflect the changes
</commit_message>
<xml_diff>
--- a/WebProgrammingReport_final.docx
+++ b/WebProgrammingReport_final.docx
@@ -157,23 +157,7 @@
           <w:sz w:val="20"/>
           <w:szCs w:val="20"/>
         </w:rPr>
-        <w:t xml:space="preserve">The codebase is </w:t>
-      </w:r>
-      <w:proofErr w:type="spellStart"/>
-      <w:r>
-        <w:rPr>
-          <w:sz w:val="20"/>
-          <w:szCs w:val="20"/>
-        </w:rPr>
-        <w:t>organised</w:t>
-      </w:r>
-      <w:proofErr w:type="spellEnd"/>
-      <w:r>
-        <w:rPr>
-          <w:sz w:val="20"/>
-          <w:szCs w:val="20"/>
-        </w:rPr>
-        <w:t xml:space="preserve"> into one feature module per business area, supported by a shared foundation layer. Every feature module keeps the same internal shape, which is a route entry point, a </w:t>
+        <w:t xml:space="preserve">The codebase is organised into one feature module per business area, supported by a shared foundation layer. Every feature module keeps the same internal shape, which is a route entry point, a </w:t>
       </w:r>
       <w:r>
         <w:rPr>
@@ -282,23 +266,7 @@
           <w:sz w:val="20"/>
           <w:szCs w:val="20"/>
         </w:rPr>
-        <w:t xml:space="preserve">Alongside the feature modules sits a small foundation layer that the whole system shares. It holds the authentication extractors and role guards, one unified error type, the four domain traits, the database pool and migration runner, and a few date and time helpers. </w:t>
-      </w:r>
-      <w:proofErr w:type="spellStart"/>
-      <w:r>
-        <w:rPr>
-          <w:sz w:val="20"/>
-          <w:szCs w:val="20"/>
-        </w:rPr>
-        <w:t>Centralising</w:t>
-      </w:r>
-      <w:proofErr w:type="spellEnd"/>
-      <w:r>
-        <w:rPr>
-          <w:sz w:val="20"/>
-          <w:szCs w:val="20"/>
-        </w:rPr>
-        <w:t xml:space="preserve"> these concerns means that security and error handling are written once and reused everywhere, rather than being repeated, and possibly done differently, inside each module.</w:t>
+        <w:t>Alongside the feature modules sits a small foundation layer that the whole system shares. It holds the authentication extractors and role guards, one unified error type, the four domain traits, the database pool and migration runner, and a few date and time helpers. Centralising these concerns means that security and error handling are written once and reused everywhere, rather than being repeated, and possibly done differently, inside each module.</w:t>
       </w:r>
     </w:p>
     <w:p>
@@ -315,39 +283,7 @@
           <w:sz w:val="20"/>
           <w:szCs w:val="20"/>
         </w:rPr>
-        <w:t xml:space="preserve">Rust is not a class-based language, but it expresses the same object-oriented ideas through traits, structs with methods, and </w:t>
-      </w:r>
-      <w:proofErr w:type="spellStart"/>
-      <w:r>
-        <w:rPr>
-          <w:sz w:val="20"/>
-          <w:szCs w:val="20"/>
-        </w:rPr>
-        <w:t>enums</w:t>
-      </w:r>
-      <w:proofErr w:type="spellEnd"/>
-      <w:r>
-        <w:rPr>
-          <w:sz w:val="20"/>
-          <w:szCs w:val="20"/>
-        </w:rPr>
-        <w:t xml:space="preserve">. We defined four shared traits so that unrelated types reuse one correct implementation of common </w:t>
-      </w:r>
-      <w:proofErr w:type="spellStart"/>
-      <w:r>
-        <w:rPr>
-          <w:sz w:val="20"/>
-          <w:szCs w:val="20"/>
-        </w:rPr>
-        <w:t>behaviour</w:t>
-      </w:r>
-      <w:proofErr w:type="spellEnd"/>
-      <w:r>
-        <w:rPr>
-          <w:sz w:val="20"/>
-          <w:szCs w:val="20"/>
-        </w:rPr>
-        <w:t xml:space="preserve"> instead of copying it. This is how the project achieves polymorphism and abstraction without classical inheritance.</w:t>
+        <w:t>Rust is not a class-based language, but it expresses the same object-oriented ideas through traits, structs with methods, and enums. We defined four shared traits so that unrelated types reuse one correct implementation of common behaviour instead of copying it. This is how the project achieves polymorphism and abstraction without classical inheritance.</w:t>
       </w:r>
     </w:p>
     <w:tbl>
@@ -517,7 +453,6 @@
                 <w:szCs w:val="18"/>
               </w:rPr>
             </w:pPr>
-            <w:proofErr w:type="spellStart"/>
             <w:r>
               <w:rPr>
                 <w:sz w:val="18"/>
@@ -525,7 +460,6 @@
               </w:rPr>
               <w:t>TimeSlotted</w:t>
             </w:r>
-            <w:proofErr w:type="spellEnd"/>
           </w:p>
         </w:tc>
         <w:tc>
@@ -559,33 +493,8 @@
                 <w:sz w:val="18"/>
                 <w:szCs w:val="18"/>
               </w:rPr>
-              <w:t xml:space="preserve">Appointment, </w:t>
+              <w:t>Appointment, WaitlistEntry, DoctorAvailability</w:t>
             </w:r>
-            <w:proofErr w:type="spellStart"/>
-            <w:r>
-              <w:rPr>
-                <w:sz w:val="18"/>
-                <w:szCs w:val="18"/>
-              </w:rPr>
-              <w:t>WaitlistEntry</w:t>
-            </w:r>
-            <w:proofErr w:type="spellEnd"/>
-            <w:r>
-              <w:rPr>
-                <w:sz w:val="18"/>
-                <w:szCs w:val="18"/>
-              </w:rPr>
-              <w:t xml:space="preserve">, </w:t>
-            </w:r>
-            <w:proofErr w:type="spellStart"/>
-            <w:r>
-              <w:rPr>
-                <w:sz w:val="18"/>
-                <w:szCs w:val="18"/>
-              </w:rPr>
-              <w:t>DoctorAvailability</w:t>
-            </w:r>
-            <w:proofErr w:type="spellEnd"/>
           </w:p>
         </w:tc>
         <w:tc>
@@ -651,7 +560,6 @@
                 <w:szCs w:val="18"/>
               </w:rPr>
             </w:pPr>
-            <w:proofErr w:type="spellStart"/>
             <w:r>
               <w:rPr>
                 <w:sz w:val="18"/>
@@ -659,7 +567,6 @@
               </w:rPr>
               <w:t>StatusManaged</w:t>
             </w:r>
-            <w:proofErr w:type="spellEnd"/>
           </w:p>
         </w:tc>
         <w:tc>
@@ -693,17 +600,8 @@
                 <w:sz w:val="18"/>
                 <w:szCs w:val="18"/>
               </w:rPr>
-              <w:t xml:space="preserve">Appointment, Invoice, </w:t>
+              <w:t>Appointment, Invoice, WaitlistEntry</w:t>
             </w:r>
-            <w:proofErr w:type="spellStart"/>
-            <w:r>
-              <w:rPr>
-                <w:sz w:val="18"/>
-                <w:szCs w:val="18"/>
-              </w:rPr>
-              <w:t>WaitlistEntry</w:t>
-            </w:r>
-            <w:proofErr w:type="spellEnd"/>
           </w:p>
         </w:tc>
         <w:tc>
@@ -737,23 +635,7 @@
                 <w:sz w:val="18"/>
                 <w:szCs w:val="18"/>
               </w:rPr>
-              <w:t xml:space="preserve">Polymorphism. One status interface with type-specific active rules and badge </w:t>
-            </w:r>
-            <w:proofErr w:type="spellStart"/>
-            <w:r>
-              <w:rPr>
-                <w:sz w:val="18"/>
-                <w:szCs w:val="18"/>
-              </w:rPr>
-              <w:t>colours</w:t>
-            </w:r>
-            <w:proofErr w:type="spellEnd"/>
-            <w:r>
-              <w:rPr>
-                <w:sz w:val="18"/>
-                <w:szCs w:val="18"/>
-              </w:rPr>
-              <w:t>.</w:t>
+              <w:t>Polymorphism. One status interface with type-specific active rules and badge colours.</w:t>
             </w:r>
           </w:p>
         </w:tc>
@@ -825,17 +707,8 @@
                 <w:sz w:val="18"/>
                 <w:szCs w:val="18"/>
               </w:rPr>
-              <w:t xml:space="preserve">Appointment, </w:t>
+              <w:t>Appointment, WaitlistEntry</w:t>
             </w:r>
-            <w:proofErr w:type="spellStart"/>
-            <w:r>
-              <w:rPr>
-                <w:sz w:val="18"/>
-                <w:szCs w:val="18"/>
-              </w:rPr>
-              <w:t>WaitlistEntry</w:t>
-            </w:r>
-            <w:proofErr w:type="spellEnd"/>
           </w:p>
         </w:tc>
         <w:tc>
@@ -869,23 +742,7 @@
                 <w:sz w:val="18"/>
                 <w:szCs w:val="18"/>
               </w:rPr>
-              <w:t xml:space="preserve">Abstraction. A single triage mapping from level 1 to 4 into a label and a </w:t>
-            </w:r>
-            <w:proofErr w:type="spellStart"/>
-            <w:r>
-              <w:rPr>
-                <w:sz w:val="18"/>
-                <w:szCs w:val="18"/>
-              </w:rPr>
-              <w:t>colour</w:t>
-            </w:r>
-            <w:proofErr w:type="spellEnd"/>
-            <w:r>
-              <w:rPr>
-                <w:sz w:val="18"/>
-                <w:szCs w:val="18"/>
-              </w:rPr>
-              <w:t>.</w:t>
+              <w:t>Abstraction. A single triage mapping from level 1 to 4 into a label and a colour.</w:t>
             </w:r>
           </w:p>
         </w:tc>
@@ -957,23 +814,7 @@
                 <w:sz w:val="18"/>
                 <w:szCs w:val="18"/>
               </w:rPr>
-              <w:t xml:space="preserve">Appointment, Invoice, </w:t>
-            </w:r>
-            <w:proofErr w:type="spellStart"/>
-            <w:r>
-              <w:rPr>
-                <w:sz w:val="18"/>
-                <w:szCs w:val="18"/>
-              </w:rPr>
-              <w:t>MedicalRecord</w:t>
-            </w:r>
-            <w:proofErr w:type="spellEnd"/>
-            <w:r>
-              <w:rPr>
-                <w:sz w:val="18"/>
-                <w:szCs w:val="18"/>
-              </w:rPr>
-              <w:t>, Prescription</w:t>
+              <w:t>Appointment, Invoice, MedicalRecord, Prescription</w:t>
             </w:r>
           </w:p>
         </w:tc>
@@ -1069,29 +910,7 @@
           <w:sz w:val="20"/>
           <w:szCs w:val="20"/>
         </w:rPr>
-        <w:t xml:space="preserve"> type only permits a cancellation or a reassignment while it is still scheduled, which makes an invalid state change impossible to express. Error handling is unified through a single application error type with eight variants that implements the framework </w:t>
-      </w:r>
-      <w:proofErr w:type="spellStart"/>
-      <w:r>
-        <w:rPr>
-          <w:sz w:val="20"/>
-          <w:szCs w:val="20"/>
-        </w:rPr>
-        <w:t>ResponseError</w:t>
-      </w:r>
-      <w:proofErr w:type="spellEnd"/>
-      <w:r>
-        <w:rPr>
-          <w:sz w:val="20"/>
-          <w:szCs w:val="20"/>
-        </w:rPr>
-        <w:t xml:space="preserve"> trait. Because every lower-level failure, whether from the database, the template engine, or the password library, converts into this one type, handlers can use the </w:t>
-      </w:r>
-      <w:r>
-        <w:rPr>
-          <w:sz w:val="20"/>
-          <w:szCs w:val="20"/>
-        </w:rPr>
+        <w:t xml:space="preserve"> type only permits a cancellation or a reassignment while it is still scheduled, which makes an invalid state change impossible to express. Error handling is unified through a single application error type with eight variants that implements the framework ResponseError trait. Because every lower-level failure, whether from the database, the template engine, or the password library, converts into this one type, handlers can use the </w:t>
         <w:lastRenderedPageBreak/>
         <w:t>question-mark operator to pass errors upward cleanly, and the matching response code of 400, 401, 403, 404, or 500 is decided in one place.</w:t>
       </w:r>
@@ -1127,7 +946,7 @@
           <w:sz w:val="20"/>
           <w:szCs w:val="20"/>
         </w:rPr>
-        <w:t>The scheduling engine carries most of the technical weight, and four algorithms work together inside it.</w:t>
+        <w:t>The scheduling engine carries most of the technical weight, and five algorithms work together inside it.</w:t>
       </w:r>
     </w:p>
     <w:p>
@@ -1167,7 +986,25 @@
           <w:sz w:val="20"/>
           <w:szCs w:val="20"/>
         </w:rPr>
-        <w:t xml:space="preserve"> uses the standard interval-overlap test, where two periods clash when one starts before the other ends and ends after the other starts, checked against the doctor and, when a room is assigned, against the room as well. </w:t>
+        <w:t xml:space="preserve"> uses the standard interval-overlap test, where two periods clash when one starts before the other ends and ends after the other starts, checked against the doctor </w:t>
+      </w:r>
+      <w:r>
+        <w:rPr>
+          <w:i/>
+          <w:iCs/>
+          <w:color w:val="000000"/>
+          <w:sz w:val="20"/>
+          <w:szCs w:val="20"/>
+        </w:rPr>
+        <w:t>or</w:t>
+      </w:r>
+      <w:r>
+        <w:rPr>
+          <w:color w:val="000000"/>
+          <w:sz w:val="20"/>
+          <w:szCs w:val="20"/>
+        </w:rPr>
+        <w:t xml:space="preserve"> the assigned room, so a doctor moved into a different room for one visit still cannot be double-booked. </w:t>
       </w:r>
     </w:p>
     <w:p>
@@ -1302,56 +1139,64 @@
           <w:sz w:val="20"/>
           <w:szCs w:val="20"/>
         </w:rPr>
-        <w:t xml:space="preserve"> moves a patient to another doctor when one becomes unavailable, ranking candidates by matching </w:t>
-      </w:r>
-      <w:proofErr w:type="spellStart"/>
-      <w:r>
-        <w:rPr>
-          <w:color w:val="000000"/>
-          <w:sz w:val="20"/>
-          <w:szCs w:val="20"/>
-        </w:rPr>
-        <w:t>specialisation</w:t>
-      </w:r>
-      <w:proofErr w:type="spellEnd"/>
-      <w:r>
-        <w:rPr>
-          <w:color w:val="000000"/>
-          <w:sz w:val="20"/>
-          <w:szCs w:val="20"/>
-        </w:rPr>
-        <w:t xml:space="preserve"> first for continuity of care and then by the lightest workload that day.</w:t>
-      </w:r>
-    </w:p>
-    <w:p>
-      <w:pPr>
+        <w:t xml:space="preserve"> moves a patient to another doctor when one becomes unavailable, ranking candidates by matching specialisation first for continuity of care and then by the lightest workload that day.</w:t>
+      </w:r>
+    </w:p>
+    <w:p>
+      <w:pPr>
+        <w:numPr>
+          <w:ilvl w:val="0"/>
+          <w:numId w:val="3"/>
+        </w:numPr>
+        <w:pBdr>
+          <w:top w:val="nil"/>
+          <w:left w:val="nil"/>
+          <w:bottom w:val="nil"/>
+          <w:right w:val="nil"/>
+          <w:between w:val="nil"/>
+        </w:pBdr>
         <w:spacing w:after="80" w:line="264" w:lineRule="auto"/>
         <w:jc w:val="both"/>
         <w:rPr>
-          <w:sz w:val="20"/>
-          <w:szCs w:val="20"/>
-        </w:rPr>
-      </w:pPr>
-      <w:r>
-        <w:rPr>
-          <w:sz w:val="20"/>
-          <w:szCs w:val="20"/>
-        </w:rPr>
-        <w:t>When a booking is made</w:t>
-      </w:r>
-      <w:r>
-        <w:rPr>
-          <w:sz w:val="20"/>
-          <w:szCs w:val="20"/>
-        </w:rPr>
-        <w:t xml:space="preserve">, the system confirms the time falls within the clinic's operating hours, checks availability rules, and looks for overlaps. If the slot is open, the system assigns a room and saves the booking inside a database transaction. If the slot is taken, </w:t>
-      </w:r>
-      <w:r>
-        <w:rPr>
-          <w:sz w:val="20"/>
-          <w:szCs w:val="20"/>
-        </w:rPr>
-        <w:t>a patient’s request is rejected with an alternative-slot suggestion, while staff bookings follow the priority decision rules in Figure 2:</w:t>
+          <w:color w:val="000000"/>
+          <w:sz w:val="20"/>
+          <w:szCs w:val="20"/>
+        </w:rPr>
+      </w:pPr>
+      <w:r>
+        <w:rPr>
+          <w:b/>
+          <w:bCs/>
+          <w:color w:val="000000"/>
+          <w:sz w:val="20"/>
+          <w:szCs w:val="20"/>
+        </w:rPr>
+        <w:t>Optimal batch reassignment</w:t>
+      </w:r>
+      <w:r>
+        <w:rPr>
+          <w:color w:val="000000"/>
+          <w:sz w:val="20"/>
+          <w:szCs w:val="20"/>
+        </w:rPr>
+        <w:t xml:space="preserve"> handles a doctor’s whole day off at once instead of one appointment at a time, modelling every appointment against every colleague as a cost matrix and solving it with the Hungarian algorithm, so the redistribution is provably the least disruptive rather than whichever the greedy pass reaches first.</w:t>
+      </w:r>
+    </w:p>
+    <w:p>
+      <w:pPr>
+        <w:spacing w:after="80" w:line="264" w:lineRule="auto"/>
+        <w:jc w:val="both"/>
+        <w:rPr>
+          <w:sz w:val="20"/>
+          <w:szCs w:val="20"/>
+        </w:rPr>
+      </w:pPr>
+      <w:r>
+        <w:rPr>
+          <w:sz w:val="20"/>
+          <w:szCs w:val="20"/>
+        </w:rPr>
+        <w:t>When a booking is made, the system confirms the time falls within the clinic's operating hours, checks availability rules, and looks for overlaps. If the slot is open, the system assigns a room and saves the booking inside a database transaction. If the slot is taken, a patient’s request is rejected with an alternative-slot suggestion, while staff bookings follow the priority decision rules in Figure 2:</w:t>
       </w:r>
     </w:p>
     <w:p>
@@ -1539,23 +1384,7 @@
           <w:sz w:val="20"/>
           <w:szCs w:val="20"/>
         </w:rPr>
-        <w:t xml:space="preserve">Two further features add breadth. Medical reports are exported to PDF entirely in Rust using the </w:t>
-      </w:r>
-      <w:proofErr w:type="spellStart"/>
-      <w:r>
-        <w:rPr>
-          <w:sz w:val="20"/>
-          <w:szCs w:val="20"/>
-        </w:rPr>
-        <w:t>printpdf</w:t>
-      </w:r>
-      <w:proofErr w:type="spellEnd"/>
-      <w:r>
-        <w:rPr>
-          <w:sz w:val="20"/>
-          <w:szCs w:val="20"/>
-        </w:rPr>
-        <w:t xml:space="preserve"> crate, with manual page layout, word wrapping, and automatic pagination, so no external program or font file is needed and the project runs unchanged on any machine. A patient timeline merges appointments, records, and prescriptions into one ordered history that gives a clinician the full picture of a patient at a glance. Running across all of these is an append-only audit trail that records every security and business action, such as a booking, a cancellation, a record change, or a report export, together with the user who performed it and the time it happened, giving the system a tamper-evident history that only administrators can view.</w:t>
+        <w:t>Two further features add breadth. Medical reports are exported to PDF entirely in Rust using the printpdf crate, with manual page layout, word wrapping, and automatic pagination, so no external program or font file is needed and the project runs unchanged on any machine. A patient timeline merges appointments, records, and prescriptions into one ordered history that gives a clinician the full picture of a patient at a glance. Running across all of these is an append-only audit trail that records every security and business action, such as a booking, a cancellation, a record change, or a report export, together with the user who performed it and the time it happened, giving the system a tamper-evident history that only administrators can view.</w:t>
       </w:r>
     </w:p>
     <w:p>
@@ -1606,37 +1435,7 @@
           <w:sz w:val="20"/>
           <w:szCs w:val="20"/>
         </w:rPr>
-        <w:t xml:space="preserve">The schema holds fifteen </w:t>
-      </w:r>
-      <w:proofErr w:type="spellStart"/>
-      <w:r>
-        <w:rPr>
-          <w:sz w:val="20"/>
-          <w:szCs w:val="20"/>
-        </w:rPr>
-        <w:t>normalised</w:t>
-      </w:r>
-      <w:proofErr w:type="spellEnd"/>
-      <w:r>
-        <w:rPr>
-          <w:sz w:val="20"/>
-          <w:szCs w:val="20"/>
-        </w:rPr>
-        <w:t xml:space="preserve"> tables defined across </w:t>
-      </w:r>
-      <w:r>
-        <w:rPr>
-          <w:sz w:val="20"/>
-          <w:szCs w:val="20"/>
-        </w:rPr>
-        <w:t>six</w:t>
-      </w:r>
-      <w:r>
-        <w:rPr>
-          <w:sz w:val="20"/>
-          <w:szCs w:val="20"/>
-        </w:rPr>
-        <w:t xml:space="preserve"> migrations that run automatically the first time the server starts. Foreign keys, check constraints, and indexes enforce integrity inside the database rather than relying on application code alone, so the data stays valid even if a bug slips into a handler.</w:t>
+        <w:t>The schema holds fifteen normalised tables defined across six migrations that run automatically the first time the server starts. Foreign keys, check constraints, and indexes enforce integrity inside the database rather than relying on application code alone, so the data stays valid even if a bug slips into a handler.</w:t>
       </w:r>
     </w:p>
     <w:tbl>
@@ -1879,55 +1678,7 @@
                 <w:sz w:val="18"/>
                 <w:szCs w:val="18"/>
               </w:rPr>
-              <w:t xml:space="preserve">appointments and the </w:t>
-            </w:r>
-            <w:proofErr w:type="spellStart"/>
-            <w:r>
-              <w:rPr>
-                <w:sz w:val="18"/>
-                <w:szCs w:val="18"/>
-              </w:rPr>
-              <w:t>appointment_slots</w:t>
-            </w:r>
-            <w:proofErr w:type="spellEnd"/>
-            <w:r>
-              <w:rPr>
-                <w:sz w:val="18"/>
-                <w:szCs w:val="18"/>
-              </w:rPr>
-              <w:t xml:space="preserve"> occupancy ledger, plus </w:t>
-            </w:r>
-            <w:proofErr w:type="spellStart"/>
-            <w:r>
-              <w:rPr>
-                <w:sz w:val="18"/>
-                <w:szCs w:val="18"/>
-              </w:rPr>
-              <w:t>doctor_availability</w:t>
-            </w:r>
-            <w:proofErr w:type="spellEnd"/>
-            <w:r>
-              <w:rPr>
-                <w:sz w:val="18"/>
-                <w:szCs w:val="18"/>
-              </w:rPr>
-              <w:t xml:space="preserve">, rooms, </w:t>
-            </w:r>
-            <w:proofErr w:type="spellStart"/>
-            <w:r>
-              <w:rPr>
-                <w:sz w:val="18"/>
-                <w:szCs w:val="18"/>
-              </w:rPr>
-              <w:t>doctor_room_assignments</w:t>
-            </w:r>
-            <w:proofErr w:type="spellEnd"/>
-            <w:r>
-              <w:rPr>
-                <w:sz w:val="18"/>
-                <w:szCs w:val="18"/>
-              </w:rPr>
-              <w:t>, and waitlist.</w:t>
+              <w:t>appointments and the appointment_slots occupancy ledger, plus doctor_availability, rooms, doctor_room_assignments, and waitlist.</w:t>
             </w:r>
           </w:p>
         </w:tc>
@@ -1994,21 +1745,12 @@
                 <w:szCs w:val="18"/>
               </w:rPr>
             </w:pPr>
-            <w:proofErr w:type="spellStart"/>
             <w:r>
               <w:rPr>
                 <w:sz w:val="18"/>
                 <w:szCs w:val="18"/>
               </w:rPr>
-              <w:t>medical_records</w:t>
-            </w:r>
-            <w:proofErr w:type="spellEnd"/>
-            <w:r>
-              <w:rPr>
-                <w:sz w:val="18"/>
-                <w:szCs w:val="18"/>
-              </w:rPr>
-              <w:t xml:space="preserve"> and prescriptions, each linked back to an appointment.</w:t>
+              <w:t>medical_records and prescriptions, each linked back to an appointment.</w:t>
             </w:r>
           </w:p>
         </w:tc>
@@ -2080,23 +1822,7 @@
                 <w:sz w:val="18"/>
                 <w:szCs w:val="18"/>
               </w:rPr>
-              <w:t xml:space="preserve">invoices with their </w:t>
-            </w:r>
-            <w:proofErr w:type="spellStart"/>
-            <w:r>
-              <w:rPr>
-                <w:sz w:val="18"/>
-                <w:szCs w:val="18"/>
-              </w:rPr>
-              <w:t>invoice_items</w:t>
-            </w:r>
-            <w:proofErr w:type="spellEnd"/>
-            <w:r>
-              <w:rPr>
-                <w:sz w:val="18"/>
-                <w:szCs w:val="18"/>
-              </w:rPr>
-              <w:t xml:space="preserve"> and payments.</w:t>
+              <w:t>invoices with their invoice_items and payments.</w:t>
             </w:r>
           </w:p>
         </w:tc>
@@ -2163,21 +1889,12 @@
                 <w:szCs w:val="18"/>
               </w:rPr>
             </w:pPr>
-            <w:proofErr w:type="spellStart"/>
             <w:r>
               <w:rPr>
                 <w:sz w:val="18"/>
                 <w:szCs w:val="18"/>
               </w:rPr>
-              <w:t>audit_log</w:t>
-            </w:r>
-            <w:proofErr w:type="spellEnd"/>
-            <w:r>
-              <w:rPr>
-                <w:sz w:val="18"/>
-                <w:szCs w:val="18"/>
-              </w:rPr>
-              <w:t>, an append-only record of who did what and when.</w:t>
+              <w:t>audit_log, an append-only record of who did what and when.</w:t>
             </w:r>
           </w:p>
         </w:tc>
@@ -2206,23 +1923,7 @@
           <w:sz w:val="20"/>
           <w:szCs w:val="20"/>
         </w:rPr>
-        <w:t xml:space="preserve">The occupancy ledger is the </w:t>
-      </w:r>
-      <w:proofErr w:type="spellStart"/>
-      <w:r>
-        <w:rPr>
-          <w:sz w:val="20"/>
-          <w:szCs w:val="20"/>
-        </w:rPr>
-        <w:t>centre</w:t>
-      </w:r>
-      <w:proofErr w:type="spellEnd"/>
-      <w:r>
-        <w:rPr>
-          <w:sz w:val="20"/>
-          <w:szCs w:val="20"/>
-        </w:rPr>
-        <w:t xml:space="preserve"> of the design. Storing one row per slot instead of a single start and end time is what lets the unique index do the locking, because a clash becomes a duplicate key rather than a value comparison that two requests could pass at the same moment. Foreign keys with cascade rules keep the ledger and the appointment in step, so cancelling or moving an appointment deletes its slot rows and frees the time at once, which in turn lets the waitlist promote a waiting patient into the gap. SQLite was chosen so the application runs smoothly without complex external software setup</w:t>
+        <w:t>The occupancy ledger is the centre of the design. Storing one row per slot instead of a single start and end time is what lets the unique index do the locking, because a clash becomes a duplicate key rather than a value comparison that two requests could pass at the same moment. Foreign keys with cascade rules keep the ledger and the appointment in step, so cancelling or moving an appointment deletes its slot rows and frees the time at once, which in turn lets the waitlist promote a waiting patient into the gap. SQLite was chosen so the application runs smoothly without complex external software setup</w:t>
       </w:r>
     </w:p>
     <w:p>
@@ -2256,23 +1957,7 @@
           <w:sz w:val="20"/>
           <w:szCs w:val="20"/>
         </w:rPr>
-        <w:t xml:space="preserve">The user interface is generated on the server using Tera templates with layout inheritance. A single layout file defines the main structure and navigation bars, allowing the 30 individual page templates to remain light and clean. We used the </w:t>
-      </w:r>
-      <w:proofErr w:type="spellStart"/>
-      <w:r>
-        <w:rPr>
-          <w:sz w:val="20"/>
-          <w:szCs w:val="20"/>
-        </w:rPr>
-        <w:t>Bulma</w:t>
-      </w:r>
-      <w:proofErr w:type="spellEnd"/>
-      <w:r>
-        <w:rPr>
-          <w:sz w:val="20"/>
-          <w:szCs w:val="20"/>
-        </w:rPr>
-        <w:t xml:space="preserve"> framework to make the layout fully responsive across mobile and desktop devices. The navigation menus adjust dynamically based on user roles, hiding restricted links from patients while displaying administrative management pages only to staff.</w:t>
+        <w:t>The user interface is generated on the server using Tera templates with layout inheritance. A single layout file defines the main structure and navigation bars, allowing the 27 individual page templates to remain light and clean. We used the Bulma framework to make the layout fully responsive across mobile and desktop devices. The navigation menus adjust dynamically based on user roles, hiding restricted links from patients while displaying administrative management pages only to staff.</w:t>
       </w:r>
     </w:p>
     <w:p>
@@ -2307,23 +1992,7 @@
           <w:szCs w:val="20"/>
         </w:rPr>
         <w:lastRenderedPageBreak/>
-        <w:t xml:space="preserve">Security was treated as a first-class concern rather than an afterthought. Passwords are stored only as </w:t>
-      </w:r>
-      <w:proofErr w:type="spellStart"/>
-      <w:r>
-        <w:rPr>
-          <w:sz w:val="20"/>
-          <w:szCs w:val="20"/>
-        </w:rPr>
-        <w:t>bcrypt</w:t>
-      </w:r>
-      <w:proofErr w:type="spellEnd"/>
-      <w:r>
-        <w:rPr>
-          <w:sz w:val="20"/>
-          <w:szCs w:val="20"/>
-        </w:rPr>
-        <w:t xml:space="preserve"> hashes with a fixed work factor, sessions are held in signed cookies so their contents cannot be tampered with, and the signing key is generated once and reused across restarts so users are not logged out on every restart. Access is controlled on two levels. Role guards decide who may reach a route, so only staff can open billing management and only an administrator can see the dashboard and the audit trail. Ownership checks then decide who may see a specific record, so a patient can open only their own appointments, invoices, and medical reports, and an attempt to reach another patient data returns a forbidden response instead of leaking it. Together with the timing-safe login and the append-only audit trail, these measures give the system a realistic security posture for handling sensitive health information.</w:t>
+        <w:t>Security was treated as a first-class concern rather than an afterthought. Passwords are stored only as bcrypt hashes with a fixed work factor, sessions are held in signed cookies so their contents cannot be tampered with, and the signing key is generated once and reused across restarts so users are not logged out on every restart. Access is controlled on two levels. Role guards decide who may reach a route, so only staff can open billing management and only an administrator can see the dashboard and the audit trail. Ownership checks then decide who may see a specific record, so a patient can open only their own appointments, invoices, and medical reports, and an attempt to reach another patient data returns a forbidden response instead of leaking it. Together with the timing-safe login and the append-only audit trail, these measures give the system a realistic security posture for handling sensitive health information.</w:t>
       </w:r>
     </w:p>
     <w:p>
@@ -2357,39 +2026,7 @@
           <w:sz w:val="20"/>
           <w:szCs w:val="20"/>
         </w:rPr>
-        <w:t xml:space="preserve">Preventing double booking safely was our primary technical challenge. As detailed in our database architecture, enforcing concurrency via storage constraints completely bypassed the risks of application-level validation race windows. Managing multi-key criteria in the scheduling queue introduced algorithmic edge cases where naive sorting returned inverted patient priority rankings. Correcting the internal comparison logic resolved the issue, and a multi-priority regression test was added to guarantee future queue stability under high load. SQLite stores </w:t>
-      </w:r>
-      <w:proofErr w:type="spellStart"/>
-      <w:r>
-        <w:rPr>
-          <w:sz w:val="20"/>
-          <w:szCs w:val="20"/>
-        </w:rPr>
-        <w:t>booleans</w:t>
-      </w:r>
-      <w:proofErr w:type="spellEnd"/>
-      <w:r>
-        <w:rPr>
-          <w:sz w:val="20"/>
-          <w:szCs w:val="20"/>
-        </w:rPr>
-        <w:t xml:space="preserve"> as integers, which broke direct decoding into Rust </w:t>
-      </w:r>
-      <w:proofErr w:type="spellStart"/>
-      <w:r>
-        <w:rPr>
-          <w:sz w:val="20"/>
-          <w:szCs w:val="20"/>
-        </w:rPr>
-        <w:t>boolean</w:t>
-      </w:r>
-      <w:proofErr w:type="spellEnd"/>
-      <w:r>
-        <w:rPr>
-          <w:sz w:val="20"/>
-          <w:szCs w:val="20"/>
-        </w:rPr>
-        <w:t xml:space="preserve"> fields, so those columns are now read as integers behind small accessor methods. Finally, the priority override touches several tables at once, so the whole sequence runs inside a single transaction that rolls back completely on any failure, which keeps the data consistent even if a step fails midway. Each of these problems taught us to push guarantees toward the type system and the database, where they hold for every code path, rather than relying on careful handling in each handler.</w:t>
+        <w:t>Preventing double booking safely was our primary technical challenge. As detailed in our database architecture, enforcing concurrency via storage constraints completely bypassed the risks of application-level validation race windows. Managing multi-key criteria in the scheduling queue introduced algorithmic edge cases where naive sorting returned inverted patient priority rankings. Correcting the internal comparison logic resolved the issue, and a multi-priority regression test was added to guarantee future queue stability under high load. SQLite stores booleans as integers, which broke direct decoding into Rust boolean fields, so those columns are now read as integers behind small accessor methods. Finally, the priority override touches several tables at once, so the whole sequence runs inside a single transaction that rolls back completely on any failure, which keeps the data consistent even if a step fails midway. Each of these problems taught us to push guarantees toward the type system and the database, where they hold for every code path, rather than relying on careful handling in each handler.</w:t>
       </w:r>
     </w:p>
     <w:p>
@@ -2550,23 +2187,7 @@
           <w:sz w:val="20"/>
           <w:szCs w:val="20"/>
         </w:rPr>
-        <w:t xml:space="preserve"> Implemented access rules into the type system using an </w:t>
-      </w:r>
-      <w:proofErr w:type="spellStart"/>
-      <w:r>
-        <w:rPr>
-          <w:sz w:val="20"/>
-          <w:szCs w:val="20"/>
-        </w:rPr>
-        <w:t>Actix</w:t>
-      </w:r>
-      <w:proofErr w:type="spellEnd"/>
-      <w:r>
-        <w:rPr>
-          <w:sz w:val="20"/>
-          <w:szCs w:val="20"/>
-        </w:rPr>
-        <w:t xml:space="preserve"> request extractor. This makes it impossible to compile a code route that accidentally omits security verification.</w:t>
+        <w:t xml:space="preserve"> Implemented access rules into the type system using an Actix request extractor. This makes it impossible to compile a code route that accidentally omits security verification.</w:t>
       </w:r>
     </w:p>
     <w:p>
@@ -2592,23 +2213,7 @@
           <w:sz w:val="20"/>
           <w:szCs w:val="20"/>
         </w:rPr>
-        <w:t xml:space="preserve"> Modeled roles as a typed </w:t>
-      </w:r>
-      <w:proofErr w:type="spellStart"/>
-      <w:r>
-        <w:rPr>
-          <w:sz w:val="20"/>
-          <w:szCs w:val="20"/>
-        </w:rPr>
-        <w:t>enum</w:t>
-      </w:r>
-      <w:proofErr w:type="spellEnd"/>
-      <w:r>
-        <w:rPr>
-          <w:sz w:val="20"/>
-          <w:szCs w:val="20"/>
-        </w:rPr>
-        <w:t xml:space="preserve"> with fail-safe parsing, ensuring a tampered session value falls back to the least-privileged role rather than accidentally leaking access privileges.</w:t>
+        <w:t xml:space="preserve"> Modeled roles as a typed enum with fail-safe parsing, ensuring a tampered session value falls back to the least-privileged role rather than accidentally leaking access privileges.</w:t>
       </w:r>
     </w:p>
     <w:p>
@@ -2960,7 +2565,7 @@
           <w:sz w:val="20"/>
           <w:szCs w:val="20"/>
         </w:rPr>
-        <w:t xml:space="preserve"> Built a validation gate applying three structured rules. Blocked entries (like leave or lunch breaks) reject bookings immediately. Valid slots must fit completely inside a doctor's custom hours, otherwise they fall back to default clinic hours. This checks recurring and one-off rules in a single step. </w:t>
+        <w:t xml:space="preserve"> Checks every booking against three simple rules: blocked time such as leave or lunch breaks is rejected straight away, a slot must fit inside the doctor's own working hours if they have set any, and the clinic's default hours apply when they have not.</w:t>
       </w:r>
     </w:p>
     <w:p>
@@ -2979,14 +2584,14 @@
           <w:sz w:val="20"/>
           <w:szCs w:val="20"/>
         </w:rPr>
-        <w:t>Dynamic Load-Balanced Reassignment:</w:t>
-      </w:r>
-      <w:r>
-        <w:rPr>
-          <w:sz w:val="20"/>
-          <w:szCs w:val="20"/>
-        </w:rPr>
-        <w:t xml:space="preserve"> Developed a greedy doctor reassignment algorithm that ranks every alternative doctor inside a single SQL query. The query optimizes for continuity of care by ranking matching specializations first, followed by the fewest appointments that day for structural load balancing, walking the ranked list to pick the first doctor available and free of conflicts.</w:t>
+        <w:t>Reassignment Algorithms (Greedy and Hungarian):</w:t>
+      </w:r>
+      <w:r>
+        <w:rPr>
+          <w:sz w:val="20"/>
+          <w:szCs w:val="20"/>
+        </w:rPr>
+        <w:t xml:space="preserve"> Built two ways to hand a patient to another doctor. A quick greedy algorithm reassigns one appointment at a time, picking the doctor with the closest matching specialty and the lightest workload. A more advanced Hungarian algorithm reassigns a doctor’s whole day at once when they go on leave, guaranteeing the least possible disruption instead of reassigning appointments one by one.</w:t>
       </w:r>
     </w:p>
     <w:p>
@@ -3005,6 +2610,32 @@
           <w:sz w:val="20"/>
           <w:szCs w:val="20"/>
         </w:rPr>
+        <w:t>Live Availability Booking:</w:t>
+      </w:r>
+      <w:r>
+        <w:rPr>
+          <w:sz w:val="20"/>
+          <w:szCs w:val="20"/>
+        </w:rPr>
+        <w:t xml:space="preserve"> Connected the same availability gate to the booking form itself, so patients only ever see time slots that are genuinely free and allowed, instead of guessing a time and having it rejected.</w:t>
+      </w:r>
+    </w:p>
+    <w:p>
+      <w:pPr>
+        <w:numPr>
+          <w:ilvl w:val="0"/>
+          <w:numId w:val="8"/>
+        </w:numPr>
+        <w:spacing w:after="80" w:line="264" w:lineRule="auto"/>
+        <w:jc w:val="both"/>
+      </w:pPr>
+      <w:r>
+        <w:rPr>
+          <w:b/>
+          <w:bCs/>
+          <w:sz w:val="20"/>
+          <w:szCs w:val="20"/>
+        </w:rPr>
         <w:t>Race-Safe Room Allocation:</w:t>
       </w:r>
       <w:r>
@@ -3012,14 +2643,7 @@
           <w:sz w:val="20"/>
           <w:szCs w:val="20"/>
         </w:rPr>
-        <w:t xml:space="preserve"> Designed an allocation system where a doctor's first daily booking locks in an available room. </w:t>
-      </w:r>
-      <w:r>
-        <w:rPr>
-          <w:sz w:val="20"/>
-          <w:szCs w:val="20"/>
-        </w:rPr>
-        <w:t>The claim is a plain INSERT guarded by two database-level UNIQUE indexes, one room per doctor per day and one doctor per room per day, so a lost race surfaces as a unique violation and the allocator retries with the next free room instead of double-assigning.</w:t>
+        <w:t xml:space="preserve"> Built a system that automatically gives each doctor a room for the day and safely handles two bookings trying to claim the same room at the same time, using database-level checks instead of manual assignment to prevent conflicts.</w:t>
       </w:r>
     </w:p>
     <w:p>
@@ -3126,23 +2750,7 @@
           <w:sz w:val="20"/>
           <w:szCs w:val="20"/>
         </w:rPr>
-        <w:t xml:space="preserve"> I created a consolidated timeline that normalizes appointments, records, prescriptions, and bills into a single history sorted by date. Utilized a typed kind </w:t>
-      </w:r>
-      <w:proofErr w:type="spellStart"/>
-      <w:r>
-        <w:rPr>
-          <w:sz w:val="20"/>
-          <w:szCs w:val="20"/>
-        </w:rPr>
-        <w:t>enum</w:t>
-      </w:r>
-      <w:proofErr w:type="spellEnd"/>
-      <w:r>
-        <w:rPr>
-          <w:sz w:val="20"/>
-          <w:szCs w:val="20"/>
-        </w:rPr>
-        <w:t xml:space="preserve"> to supply each event's icon and color so presentation details are never hardcoded at the call site.</w:t>
+        <w:t xml:space="preserve"> I created a consolidated timeline that normalizes appointments, records, prescriptions, and bills into a single history sorted by date. Utilized a typed kind enum to supply each event's icon and color so presentation details are never hardcoded at the call site.</w:t>
       </w:r>
     </w:p>
     <w:p>
@@ -3168,23 +2776,7 @@
           <w:sz w:val="20"/>
           <w:szCs w:val="20"/>
         </w:rPr>
-        <w:t xml:space="preserve"> Wrote a standalone PDF report generator using the </w:t>
-      </w:r>
-      <w:proofErr w:type="spellStart"/>
-      <w:r>
-        <w:rPr>
-          <w:sz w:val="20"/>
-          <w:szCs w:val="20"/>
-        </w:rPr>
-        <w:t>printpdf</w:t>
-      </w:r>
-      <w:proofErr w:type="spellEnd"/>
-      <w:r>
-        <w:rPr>
-          <w:sz w:val="20"/>
-          <w:szCs w:val="20"/>
-        </w:rPr>
-        <w:t xml:space="preserve"> crate and the built-in Helvetica font, allowing the printable report to run with a single command on any machine with nothing extra to install.</w:t>
+        <w:t xml:space="preserve"> Wrote a standalone PDF report generator using the printpdf crate and the built-in Helvetica font, allowing the printable report to run with a single command on any machine with nothing extra to install.</w:t>
       </w:r>
     </w:p>
     <w:p>
@@ -3456,65 +3048,7 @@
           <w:sz w:val="20"/>
           <w:szCs w:val="20"/>
         </w:rPr>
-        <w:t xml:space="preserve">The system is covered by </w:t>
-      </w:r>
-      <w:r>
-        <w:rPr>
-          <w:sz w:val="20"/>
-          <w:szCs w:val="20"/>
-        </w:rPr>
-        <w:t>165</w:t>
-      </w:r>
-      <w:r>
-        <w:rPr>
-          <w:sz w:val="20"/>
-          <w:szCs w:val="20"/>
-        </w:rPr>
-        <w:t xml:space="preserve"> automated tests, made up of </w:t>
-      </w:r>
-      <w:r>
-        <w:rPr>
-          <w:sz w:val="20"/>
-          <w:szCs w:val="20"/>
-        </w:rPr>
-        <w:t>118</w:t>
-      </w:r>
-      <w:r>
-        <w:rPr>
-          <w:sz w:val="20"/>
-          <w:szCs w:val="20"/>
-        </w:rPr>
-        <w:t xml:space="preserve"> integration tests that drive the real HTTP routes against an in-memory database and </w:t>
-      </w:r>
-      <w:r>
-        <w:rPr>
-          <w:sz w:val="20"/>
-          <w:szCs w:val="20"/>
-        </w:rPr>
-        <w:t xml:space="preserve">47 </w:t>
-      </w:r>
-      <w:r>
-        <w:rPr>
-          <w:sz w:val="20"/>
-          <w:szCs w:val="20"/>
-        </w:rPr>
-        <w:t xml:space="preserve">unit tests for pure logic such as overlap </w:t>
-      </w:r>
-      <w:proofErr w:type="spellStart"/>
-      <w:r>
-        <w:rPr>
-          <w:sz w:val="20"/>
-          <w:szCs w:val="20"/>
-        </w:rPr>
-        <w:t>maths</w:t>
-      </w:r>
-      <w:proofErr w:type="spellEnd"/>
-      <w:r>
-        <w:rPr>
-          <w:sz w:val="20"/>
-          <w:szCs w:val="20"/>
-        </w:rPr>
-        <w:t>, gap finding, and PDF word wrapping. Every test runs with no external setup, which made regression checking fast and reliable throughout development and gave us the confidence to refactor.</w:t>
+        <w:t>The system is covered by 188 automated tests, made up of 132 integration tests that drive the real HTTP routes against an in-memory database and 56 unit tests for pure logic such as overlap maths, gap finding, and PDF word wrapping. Every test runs with no external setup, which made regression checking fast and reliable throughout development and gave us the confidence to refactor.</w:t>
       </w:r>
     </w:p>
     <w:p>
@@ -3531,39 +3065,7 @@
           <w:sz w:val="20"/>
           <w:szCs w:val="20"/>
         </w:rPr>
-        <w:t xml:space="preserve">Our testing strategy leaned deliberately toward integration tests rather than mocks. A shared macro builds a complete </w:t>
-      </w:r>
-      <w:proofErr w:type="spellStart"/>
-      <w:r>
-        <w:rPr>
-          <w:sz w:val="20"/>
-          <w:szCs w:val="20"/>
-        </w:rPr>
-        <w:t>Actix</w:t>
-      </w:r>
-      <w:proofErr w:type="spellEnd"/>
-      <w:r>
-        <w:rPr>
-          <w:sz w:val="20"/>
-          <w:szCs w:val="20"/>
-        </w:rPr>
-        <w:t xml:space="preserve"> application in memory for each test, wired with every route, the session middleware, and stub templates, against a fresh in-memory SQLite database that is created and migrated from scratch. Two further macros either register and log in a user, or seed a full dataset and log in, so a test can start from a realistic signed-in state in a single line. Because the tests drive the real routes from end to end instead of calling functions in isolation, they exercise the same validation, transaction, and access-control paths that run in production, which is exactly what caught the priority-heap ordering bug and several </w:t>
-      </w:r>
-      <w:proofErr w:type="spellStart"/>
-      <w:r>
-        <w:rPr>
-          <w:sz w:val="20"/>
-          <w:szCs w:val="20"/>
-        </w:rPr>
-        <w:t>authorisation</w:t>
-      </w:r>
-      <w:proofErr w:type="spellEnd"/>
-      <w:r>
-        <w:rPr>
-          <w:sz w:val="20"/>
-          <w:szCs w:val="20"/>
-        </w:rPr>
-        <w:t xml:space="preserve"> gaps before they could reach the demo.</w:t>
+        <w:t>Our testing strategy leaned deliberately toward integration tests rather than mocks. A shared macro builds a complete Actix application in memory for each test, wired with every route, the session middleware, and stub templates, against a fresh in-memory SQLite database that is created and migrated from scratch. Two further macros either register and log in a user, or seed a full dataset and log in, so a test can start from a realistic signed-in state in a single line. Because the tests drive the real routes from end to end instead of calling functions in isolation, they exercise the same validation, transaction, and access-control paths that run in production, which is exactly what caught the priority-heap ordering bug and several authorisation gaps before they could reach the demo.</w:t>
       </w:r>
     </w:p>
     <w:tbl>
@@ -3738,17 +3240,8 @@
                 <w:sz w:val="18"/>
                 <w:szCs w:val="18"/>
               </w:rPr>
-              <w:t xml:space="preserve">Unit tests in </w:t>
+              <w:t>Unit tests in src</w:t>
             </w:r>
-            <w:proofErr w:type="spellStart"/>
-            <w:r>
-              <w:rPr>
-                <w:sz w:val="18"/>
-                <w:szCs w:val="18"/>
-              </w:rPr>
-              <w:t>src</w:t>
-            </w:r>
-            <w:proofErr w:type="spellEnd"/>
           </w:p>
         </w:tc>
         <w:tc>
@@ -3782,7 +3275,7 @@
                 <w:sz w:val="18"/>
                 <w:szCs w:val="18"/>
               </w:rPr>
-              <w:t>47</w:t>
+              <w:t>56</w:t>
             </w:r>
           </w:p>
         </w:tc>
@@ -3817,39 +3310,7 @@
                 <w:sz w:val="18"/>
                 <w:szCs w:val="18"/>
               </w:rPr>
-              <w:t xml:space="preserve">Trait logic, gap-finding </w:t>
-            </w:r>
-            <w:proofErr w:type="spellStart"/>
-            <w:r>
-              <w:rPr>
-                <w:sz w:val="18"/>
-                <w:szCs w:val="18"/>
-              </w:rPr>
-              <w:t>maths</w:t>
-            </w:r>
-            <w:proofErr w:type="spellEnd"/>
-            <w:r>
-              <w:rPr>
-                <w:sz w:val="18"/>
-                <w:szCs w:val="18"/>
-              </w:rPr>
-              <w:t xml:space="preserve">, </w:t>
-            </w:r>
-            <w:proofErr w:type="spellStart"/>
-            <w:r>
-              <w:rPr>
-                <w:sz w:val="18"/>
-                <w:szCs w:val="18"/>
-              </w:rPr>
-              <w:t>enum</w:t>
-            </w:r>
-            <w:proofErr w:type="spellEnd"/>
-            <w:r>
-              <w:rPr>
-                <w:sz w:val="18"/>
-                <w:szCs w:val="18"/>
-              </w:rPr>
-              <w:t xml:space="preserve"> round-trips, PDF word-wrap.</w:t>
+              <w:t>Trait logic, gap-finding maths, enum round-trips, PDF word-wrap.</w:t>
             </w:r>
           </w:p>
         </w:tc>
@@ -3921,7 +3382,7 @@
                 <w:sz w:val="18"/>
                 <w:szCs w:val="18"/>
               </w:rPr>
-              <w:t>36</w:t>
+              <w:t>45</w:t>
             </w:r>
           </w:p>
         </w:tc>
@@ -4135,7 +3596,7 @@
                 <w:sz w:val="18"/>
                 <w:szCs w:val="18"/>
               </w:rPr>
-              <w:t>29</w:t>
+              <w:t>30</w:t>
             </w:r>
           </w:p>
         </w:tc>
@@ -4496,6 +3957,113 @@
           </w:p>
         </w:tc>
       </w:tr>
+      <w:tr>
+        <w:tc>
+          <w:tcPr>
+            <w:tcW w:w="3050" w:type="dxa"/>
+            <w:tcBorders>
+              <w:top w:val="single" w:sz="4" w:space="0" w:color="D0DDE8"/>
+              <w:left w:val="single" w:sz="4" w:space="0" w:color="D0DDE8"/>
+              <w:bottom w:val="single" w:sz="4" w:space="0" w:color="D0DDE8"/>
+              <w:right w:val="single" w:sz="4" w:space="0" w:color="D0DDE8"/>
+            </w:tcBorders>
+            <w:shd w:val="clear" w:color="auto" w:fill="FFFFFF"/>
+            <w:tcMar>
+              <w:top w:w="30" w:type="dxa"/>
+              <w:left w:w="90" w:type="dxa"/>
+              <w:bottom w:w="30" w:type="dxa"/>
+              <w:right w:w="90" w:type="dxa"/>
+            </w:tcMar>
+            <w:vAlign w:val="center"/>
+          </w:tcPr>
+          <w:p>
+            <w:pPr>
+              <w:spacing w:before="10" w:after="10" w:line="240" w:lineRule="auto"/>
+              <w:rPr>
+                <w:sz w:val="18"/>
+                <w:szCs w:val="18"/>
+              </w:rPr>
+            </w:pPr>
+            <w:r>
+              <w:rPr>
+                <w:sz w:val="18"/>
+                <w:szCs w:val="18"/>
+              </w:rPr>
+              <w:t>Templates</w:t>
+            </w:r>
+          </w:p>
+        </w:tc>
+        <w:tc>
+          <w:tcPr>
+            <w:tcW w:w="1100" w:type="dxa"/>
+            <w:tcBorders>
+              <w:top w:val="single" w:sz="4" w:space="0" w:color="D0DDE8"/>
+              <w:left w:val="single" w:sz="4" w:space="0" w:color="D0DDE8"/>
+              <w:bottom w:val="single" w:sz="4" w:space="0" w:color="D0DDE8"/>
+              <w:right w:val="single" w:sz="4" w:space="0" w:color="D0DDE8"/>
+            </w:tcBorders>
+            <w:shd w:val="clear" w:color="auto" w:fill="FFFFFF"/>
+            <w:tcMar>
+              <w:top w:w="30" w:type="dxa"/>
+              <w:left w:w="90" w:type="dxa"/>
+              <w:bottom w:w="30" w:type="dxa"/>
+              <w:right w:w="90" w:type="dxa"/>
+            </w:tcMar>
+            <w:vAlign w:val="center"/>
+          </w:tcPr>
+          <w:p>
+            <w:pPr>
+              <w:spacing w:before="10" w:after="10" w:line="240" w:lineRule="auto"/>
+              <w:rPr>
+                <w:sz w:val="18"/>
+                <w:szCs w:val="18"/>
+              </w:rPr>
+            </w:pPr>
+            <w:r>
+              <w:rPr>
+                <w:sz w:val="18"/>
+                <w:szCs w:val="18"/>
+              </w:rPr>
+              <w:t>4</w:t>
+            </w:r>
+          </w:p>
+        </w:tc>
+        <w:tc>
+          <w:tcPr>
+            <w:tcW w:w="4638" w:type="dxa"/>
+            <w:tcBorders>
+              <w:top w:val="single" w:sz="4" w:space="0" w:color="D0DDE8"/>
+              <w:left w:val="single" w:sz="4" w:space="0" w:color="D0DDE8"/>
+              <w:bottom w:val="single" w:sz="4" w:space="0" w:color="D0DDE8"/>
+              <w:right w:val="single" w:sz="4" w:space="0" w:color="D0DDE8"/>
+            </w:tcBorders>
+            <w:shd w:val="clear" w:color="auto" w:fill="FFFFFF"/>
+            <w:tcMar>
+              <w:top w:w="30" w:type="dxa"/>
+              <w:left w:w="90" w:type="dxa"/>
+              <w:bottom w:w="30" w:type="dxa"/>
+              <w:right w:w="90" w:type="dxa"/>
+            </w:tcMar>
+            <w:vAlign w:val="center"/>
+          </w:tcPr>
+          <w:p>
+            <w:pPr>
+              <w:spacing w:before="10" w:after="10" w:line="240" w:lineRule="auto"/>
+              <w:rPr>
+                <w:sz w:val="18"/>
+                <w:szCs w:val="18"/>
+              </w:rPr>
+            </w:pPr>
+            <w:r>
+              <w:rPr>
+                <w:sz w:val="18"/>
+                <w:szCs w:val="18"/>
+              </w:rPr>
+              <w:t>Tera render checks for the batch-reassignment and live-availability booking pages.</w:t>
+            </w:r>
+          </w:p>
+        </w:tc>
+      </w:tr>
     </w:tbl>
     <w:p>
       <w:pPr>
@@ -4520,23 +4088,7 @@
           <w:sz w:val="20"/>
           <w:szCs w:val="20"/>
         </w:rPr>
-        <w:t xml:space="preserve">Building the system taught us a clear lesson about where to put guarantees. Each time we tried to enforce a rule with careful code inside a handler, such as checking for a clash before inserting a booking, an edge case or a race eventually slipped through. The fixes that lasted were the ones that moved the guarantee into the type system or the database, where it holds for every path on its own. That was true of the unique index that makes double booking impossible, the typed role </w:t>
-      </w:r>
-      <w:proofErr w:type="spellStart"/>
-      <w:r>
-        <w:rPr>
-          <w:sz w:val="20"/>
-          <w:szCs w:val="20"/>
-        </w:rPr>
-        <w:t>enum</w:t>
-      </w:r>
-      <w:proofErr w:type="spellEnd"/>
-      <w:r>
-        <w:rPr>
-          <w:sz w:val="20"/>
-          <w:szCs w:val="20"/>
-        </w:rPr>
-        <w:t xml:space="preserve"> that turns an unhandled privilege into a compile error, and the transaction that makes a half-finished priority override roll back by itself. If we were to extend the project, the same principle would guide the next features, starting with email notifications for waitlist offers and a calendar export, both of which fit cleanly behind the existing service layer without touching the correctness core.</w:t>
+        <w:t>Building the system taught us a clear lesson about where to put guarantees. Each time we tried to enforce a rule with careful code inside a handler, such as checking for a clash before inserting a booking, an edge case or a race eventually slipped through. The fixes that lasted were the ones that moved the guarantee into the type system or the database, where it holds for every path on its own. That was true of the unique index that makes double booking impossible, the typed role enum that turns an unhandled privilege into a compile error, and the transaction that makes a half-finished priority override roll back by itself. If we were to extend the project, the same principle would guide the next features, starting with email notifications for waitlist offers and a calendar export, both of which fit cleanly behind the existing service layer without touching the correctness core.</w:t>
       </w:r>
     </w:p>
     <w:p>

</xml_diff>

<commit_message>
Auto-reschedule bumped patients and expire stale waitlist entries
Priority overrides used to bump a lower-priority appointment straight
back to the waitlist with no further action. Now the bumped patient is
immediately rebooked into the doctor's next free same-day slot when one
exists (reusing the earliest-slot search), with an audit trail entry for
each auto-reschedule.

Waitlist entries whose requested window has already passed are now
swept to an "expired" status (on listing and before any promotion
attempt), instead of lingering as "waiting" or silently 404ing when
clicked.

Also:
- Restrict clinical actions (diagnoses, prescriptions) to doctors only,
  no longer admin-overridable, via a new require_doctor_only guard.
- Records and availability list pages now join through to show doctor
  and patient display names instead of raw ids.
- Expand test coverage for the new waitlist expiry and reschedule paths.
</commit_message>
<xml_diff>
--- a/WebProgrammingReport_final.docx
+++ b/WebProgrammingReport_final.docx
@@ -35,7 +35,25 @@
           <w:bCs/>
           <w:color w:val="2E86C1"/>
         </w:rPr>
-        <w:t>Project Report  |  CSC1106 Web Programming</w:t>
+        <w:t xml:space="preserve">Project </w:t>
+      </w:r>
+      <w:proofErr w:type="gramStart"/>
+      <w:r>
+        <w:rPr>
+          <w:b/>
+          <w:bCs/>
+          <w:color w:val="2E86C1"/>
+        </w:rPr>
+        <w:t>Report  |</w:t>
+      </w:r>
+      <w:proofErr w:type="gramEnd"/>
+      <w:r>
+        <w:rPr>
+          <w:b/>
+          <w:bCs/>
+          <w:color w:val="2E86C1"/>
+        </w:rPr>
+        <w:t xml:space="preserve">  CSC1106 Web Programming</w:t>
       </w:r>
     </w:p>
     <w:p>
@@ -72,7 +90,79 @@
           <w:sz w:val="16"/>
           <w:szCs w:val="16"/>
         </w:rPr>
-        <w:t xml:space="preserve">Team Members:  Muhammad ‘Afif Bin Muhd Lotfi Jarhom,  Dylan Ho Sheng Xue (3178143H),  Hanzalah Bin Mohamad Hisam ,  Lennon Lim Le Rong,  Muhammad Raees Irfan Bin Ishak </w:t>
+        <w:t xml:space="preserve">Team Members:  Muhammad ‘Afif Bin Muhd Lotfi </w:t>
+      </w:r>
+      <w:proofErr w:type="gramStart"/>
+      <w:r>
+        <w:rPr>
+          <w:color w:val="7F7F7F"/>
+          <w:sz w:val="16"/>
+          <w:szCs w:val="16"/>
+        </w:rPr>
+        <w:t>Jarhom,  Dylan</w:t>
+      </w:r>
+      <w:proofErr w:type="gramEnd"/>
+      <w:r>
+        <w:rPr>
+          <w:color w:val="7F7F7F"/>
+          <w:sz w:val="16"/>
+          <w:szCs w:val="16"/>
+        </w:rPr>
+        <w:t xml:space="preserve"> Ho Sheng Xue (3178143H</w:t>
+      </w:r>
+      <w:proofErr w:type="gramStart"/>
+      <w:r>
+        <w:rPr>
+          <w:color w:val="7F7F7F"/>
+          <w:sz w:val="16"/>
+          <w:szCs w:val="16"/>
+        </w:rPr>
+        <w:t>),  Hanzalah</w:t>
+      </w:r>
+      <w:proofErr w:type="gramEnd"/>
+      <w:r>
+        <w:rPr>
+          <w:color w:val="7F7F7F"/>
+          <w:sz w:val="16"/>
+          <w:szCs w:val="16"/>
+        </w:rPr>
+        <w:t xml:space="preserve"> Bin Mohamad </w:t>
+      </w:r>
+      <w:proofErr w:type="gramStart"/>
+      <w:r>
+        <w:rPr>
+          <w:color w:val="7F7F7F"/>
+          <w:sz w:val="16"/>
+          <w:szCs w:val="16"/>
+        </w:rPr>
+        <w:t>Hisam ,</w:t>
+      </w:r>
+      <w:proofErr w:type="gramEnd"/>
+      <w:r>
+        <w:rPr>
+          <w:color w:val="7F7F7F"/>
+          <w:sz w:val="16"/>
+          <w:szCs w:val="16"/>
+        </w:rPr>
+        <w:t xml:space="preserve">  Lennon Lim Le </w:t>
+      </w:r>
+      <w:proofErr w:type="gramStart"/>
+      <w:r>
+        <w:rPr>
+          <w:color w:val="7F7F7F"/>
+          <w:sz w:val="16"/>
+          <w:szCs w:val="16"/>
+        </w:rPr>
+        <w:t>Rong,  Muhammad</w:t>
+      </w:r>
+      <w:proofErr w:type="gramEnd"/>
+      <w:r>
+        <w:rPr>
+          <w:color w:val="7F7F7F"/>
+          <w:sz w:val="16"/>
+          <w:szCs w:val="16"/>
+        </w:rPr>
+        <w:t xml:space="preserve"> Raees Irfan Bin Ishak </w:t>
       </w:r>
     </w:p>
     <w:p>
@@ -123,7 +213,23 @@
           <w:sz w:val="20"/>
           <w:szCs w:val="20"/>
         </w:rPr>
-        <w:t>Leveraging Rust ensures memory safety and exhaustive compile-time error handling , while server-side rendering via the Tera template engine centralizes validation trust, keeping request flows straightforward and audit-safe. The implementation follows a strict validation-first pipeline: every write request verifies input data prior to SQL execution, and operations spanning multiple tables are wrapped inside database transactions to prevent partial writes. Incremental feature delivery alongside automated regression testing guarantees system stability across all operational paths.</w:t>
+        <w:t xml:space="preserve">Leveraging Rust ensures memory safety and exhaustive compile-time error </w:t>
+      </w:r>
+      <w:proofErr w:type="gramStart"/>
+      <w:r>
+        <w:rPr>
+          <w:sz w:val="20"/>
+          <w:szCs w:val="20"/>
+        </w:rPr>
+        <w:t>handling ,</w:t>
+      </w:r>
+      <w:proofErr w:type="gramEnd"/>
+      <w:r>
+        <w:rPr>
+          <w:sz w:val="20"/>
+          <w:szCs w:val="20"/>
+        </w:rPr>
+        <w:t xml:space="preserve"> while server-side rendering via the Tera template engine centralizes validation trust, keeping request flows straightforward and audit-safe. The implementation follows a strict validation-first pipeline: every write request verifies input data prior to SQL execution, and operations spanning multiple tables are wrapped inside database transactions to prevent partial writes. Incremental feature delivery alongside automated regression testing guarantees system stability across all operational paths.</w:t>
       </w:r>
     </w:p>
     <w:p>
@@ -233,7 +339,79 @@
           <w:sz w:val="18"/>
           <w:szCs w:val="18"/>
         </w:rPr>
-        <w:t>HTTP route  →  Form validation  →  Service and database transaction  →  Rendered page or redirect</w:t>
+        <w:t xml:space="preserve">HTTP </w:t>
+      </w:r>
+      <w:proofErr w:type="gramStart"/>
+      <w:r>
+        <w:rPr>
+          <w:rFonts w:ascii="Cardo" w:eastAsia="Cardo" w:hAnsi="Cardo" w:cs="Cardo"/>
+          <w:b/>
+          <w:bCs/>
+          <w:color w:val="1A5276"/>
+          <w:sz w:val="18"/>
+          <w:szCs w:val="18"/>
+        </w:rPr>
+        <w:t>route  →</w:t>
+      </w:r>
+      <w:proofErr w:type="gramEnd"/>
+      <w:r>
+        <w:rPr>
+          <w:rFonts w:ascii="Cardo" w:eastAsia="Cardo" w:hAnsi="Cardo" w:cs="Cardo"/>
+          <w:b/>
+          <w:bCs/>
+          <w:color w:val="1A5276"/>
+          <w:sz w:val="18"/>
+          <w:szCs w:val="18"/>
+        </w:rPr>
+        <w:t xml:space="preserve">  Form </w:t>
+      </w:r>
+      <w:proofErr w:type="gramStart"/>
+      <w:r>
+        <w:rPr>
+          <w:rFonts w:ascii="Cardo" w:eastAsia="Cardo" w:hAnsi="Cardo" w:cs="Cardo"/>
+          <w:b/>
+          <w:bCs/>
+          <w:color w:val="1A5276"/>
+          <w:sz w:val="18"/>
+          <w:szCs w:val="18"/>
+        </w:rPr>
+        <w:t>validation  →</w:t>
+      </w:r>
+      <w:proofErr w:type="gramEnd"/>
+      <w:r>
+        <w:rPr>
+          <w:rFonts w:ascii="Cardo" w:eastAsia="Cardo" w:hAnsi="Cardo" w:cs="Cardo"/>
+          <w:b/>
+          <w:bCs/>
+          <w:color w:val="1A5276"/>
+          <w:sz w:val="18"/>
+          <w:szCs w:val="18"/>
+        </w:rPr>
+        <w:t xml:space="preserve">  Service and database </w:t>
+      </w:r>
+      <w:proofErr w:type="gramStart"/>
+      <w:r>
+        <w:rPr>
+          <w:rFonts w:ascii="Cardo" w:eastAsia="Cardo" w:hAnsi="Cardo" w:cs="Cardo"/>
+          <w:b/>
+          <w:bCs/>
+          <w:color w:val="1A5276"/>
+          <w:sz w:val="18"/>
+          <w:szCs w:val="18"/>
+        </w:rPr>
+        <w:t>transaction  →</w:t>
+      </w:r>
+      <w:proofErr w:type="gramEnd"/>
+      <w:r>
+        <w:rPr>
+          <w:rFonts w:ascii="Cardo" w:eastAsia="Cardo" w:hAnsi="Cardo" w:cs="Cardo"/>
+          <w:b/>
+          <w:bCs/>
+          <w:color w:val="1A5276"/>
+          <w:sz w:val="18"/>
+          <w:szCs w:val="18"/>
+        </w:rPr>
+        <w:t xml:space="preserve">  Rendered page or redirect</w:t>
       </w:r>
     </w:p>
     <w:p>
@@ -495,6 +673,15 @@
               </w:rPr>
               <w:t>Appointment, WaitlistEntry, DoctorAvailability</w:t>
             </w:r>
+            <w:ins w:id="0" w:author="Claude" w:date="2026-07-05T00:00:00Z">
+              <w:r>
+                <w:rPr>
+                  <w:sz w:val="18"/>
+                  <w:szCs w:val="18"/>
+                </w:rPr>
+                <w:t>, TimeWindow</w:t>
+              </w:r>
+            </w:ins>
           </w:p>
         </w:tc>
         <w:tc>
@@ -709,6 +896,15 @@
               </w:rPr>
               <w:t>Appointment, WaitlistEntry</w:t>
             </w:r>
+            <w:ins w:id="1" w:author="Claude" w:date="2026-07-05T00:00:00Z">
+              <w:r>
+                <w:rPr>
+                  <w:sz w:val="18"/>
+                  <w:szCs w:val="18"/>
+                </w:rPr>
+                <w:t>, PriorityItem</w:t>
+              </w:r>
+            </w:ins>
           </w:p>
         </w:tc>
         <w:tc>
@@ -910,7 +1106,29 @@
           <w:sz w:val="20"/>
           <w:szCs w:val="20"/>
         </w:rPr>
-        <w:t xml:space="preserve"> type only permits a cancellation or a reassignment while it is still scheduled, which makes an invalid state change impossible to express. Error handling is unified through a single application error type with eight variants that implements the framework ResponseError trait. Because every lower-level failure, whether from the database, the template engine, or the password library, converts into this one type, handlers can use the </w:t>
+        <w:t xml:space="preserve"> type only permits a cancellation or a reassignment while it is still scheduled, which makes an invalid state change impossible to express. Error handling is unified through a single application error type with eight variants that implements </w:t>
+      </w:r>
+      <w:proofErr w:type="gramStart"/>
+      <w:r>
+        <w:rPr>
+          <w:sz w:val="20"/>
+          <w:szCs w:val="20"/>
+        </w:rPr>
+        <w:t>the framework</w:t>
+      </w:r>
+      <w:proofErr w:type="gramEnd"/>
+      <w:r>
+        <w:rPr>
+          <w:sz w:val="20"/>
+          <w:szCs w:val="20"/>
+        </w:rPr>
+        <w:t xml:space="preserve"> ResponseError trait. Because every lower-level failure, whether from the database, the template engine, or the password library, converts into this one type, handlers can use the </w:t>
+      </w:r>
+      <w:r>
+        <w:rPr>
+          <w:sz w:val="20"/>
+          <w:szCs w:val="20"/>
+        </w:rPr>
         <w:lastRenderedPageBreak/>
         <w:t>question-mark operator to pass errors upward cleanly, and the matching response code of 400, 401, 403, 404, or 500 is decided in one place.</w:t>
       </w:r>
@@ -1196,7 +1414,23 @@
           <w:sz w:val="20"/>
           <w:szCs w:val="20"/>
         </w:rPr>
-        <w:t>When a booking is made, the system confirms the time falls within the clinic's operating hours, checks availability rules, and looks for overlaps. If the slot is open, the system assigns a room and saves the booking inside a database transaction. If the slot is taken, a patient’s request is rejected with an alternative-slot suggestion, while staff bookings follow the priority decision rules in Figure 2:</w:t>
+        <w:t xml:space="preserve">When a booking is made, the system confirms the time falls within the clinic's operating hours, checks availability rules, and looks for overlaps. If the slot is open, the system assigns a room and saves the booking inside a database transaction. If the slot is taken, a patient’s request is rejected with an </w:t>
+      </w:r>
+      <w:proofErr w:type="gramStart"/>
+      <w:r>
+        <w:rPr>
+          <w:sz w:val="20"/>
+          <w:szCs w:val="20"/>
+        </w:rPr>
+        <w:t>alternative-slot</w:t>
+      </w:r>
+      <w:proofErr w:type="gramEnd"/>
+      <w:r>
+        <w:rPr>
+          <w:sz w:val="20"/>
+          <w:szCs w:val="20"/>
+        </w:rPr>
+        <w:t xml:space="preserve"> suggestion, while staff bookings follow the priority decision rules in Figure 2:</w:t>
       </w:r>
     </w:p>
     <w:p>
@@ -1292,7 +1526,23 @@
           <w:sz w:val="20"/>
           <w:szCs w:val="20"/>
         </w:rPr>
-        <w:t>The waitlist is a small state machine that keeps the schedule busy. As shown in Figure 3, an entry moves from waiting to be offered to accepted, or it expires if it is not taken in time, and any cancellation in the schedule triggers an automatic promotion that offers the freed slot to the most urgent waiting patient.</w:t>
+        <w:t xml:space="preserve">The waitlist is a small state machine that keeps the schedule busy, shown in Figure 3. A cancellation frees a slot and auto‑promotes the most urgent waiter. A priority override instead </w:t>
+      </w:r>
+      <w:proofErr w:type="gramStart"/>
+      <w:r>
+        <w:rPr>
+          <w:sz w:val="20"/>
+          <w:szCs w:val="20"/>
+        </w:rPr>
+        <w:t>searches</w:t>
+      </w:r>
+      <w:proofErr w:type="gramEnd"/>
+      <w:r>
+        <w:rPr>
+          <w:sz w:val="20"/>
+          <w:szCs w:val="20"/>
+        </w:rPr>
+        <w:t xml:space="preserve"> the same doctor’s day for the next open gap and rebooks the displaced patient there, only falling back to waiting when the day is genuinely full. An entry whose requested time passes while still waiting is automatically swept to expired.</w:t>
       </w:r>
     </w:p>
     <w:p>
@@ -1319,7 +1569,7 @@
         <w:lastRenderedPageBreak/>
         <w:drawing>
           <wp:inline distT="114300" distB="114300" distL="114300" distR="114300" wp14:anchorId="471ADEFD" wp14:editId="6CE9780F">
-            <wp:extent cx="4554693" cy="1726988"/>
+            <wp:extent cx="4554693" cy="2168901"/>
             <wp:effectExtent l="0" t="0" r="0" b="0"/>
             <wp:docPr id="1" name="image2.png"/>
             <wp:cNvGraphicFramePr/>
@@ -1340,7 +1590,7 @@
                   <pic:spPr>
                     <a:xfrm>
                       <a:off x="0" y="0"/>
-                      <a:ext cx="4554693" cy="1726988"/>
+                      <a:ext cx="4554693" cy="2168901"/>
                     </a:xfrm>
                     <a:prstGeom prst="rect">
                       <a:avLst/>
@@ -1367,7 +1617,7 @@
           <w:sz w:val="16"/>
           <w:szCs w:val="16"/>
         </w:rPr>
-        <w:t>Figure 3. Waitlist lifecycle. A cancellation elsewhere promotes the most urgent waiting patient automatically.</w:t>
+        <w:t>Figure 3. Waitlist lifecycle. A freed slot auto‑promotes the most urgent waiter, a priority‑override bump auto‑reschedules the displaced patient into the next free slot or leaves them waiting if none exists, and a stale request expires.</w:t>
       </w:r>
     </w:p>
     <w:p>
@@ -1384,7 +1634,39 @@
           <w:sz w:val="20"/>
           <w:szCs w:val="20"/>
         </w:rPr>
-        <w:t>Two further features add breadth. Medical reports are exported to PDF entirely in Rust using the printpdf crate, with manual page layout, word wrapping, and automatic pagination, so no external program or font file is needed and the project runs unchanged on any machine. A patient timeline merges appointments, records, and prescriptions into one ordered history that gives a clinician the full picture of a patient at a glance. Running across all of these is an append-only audit trail that records every security and business action, such as a booking, a cancellation, a record change, or a report export, together with the user who performed it and the time it happened, giving the system a tamper-evident history that only administrators can view.</w:t>
+        <w:t xml:space="preserve">Two further features add breadth. Medical reports are exported to PDF entirely in Rust using the printpdf crate, with manual page layout, word wrapping, and automatic pagination, so no external program or font file is </w:t>
+      </w:r>
+      <w:proofErr w:type="gramStart"/>
+      <w:r>
+        <w:rPr>
+          <w:sz w:val="20"/>
+          <w:szCs w:val="20"/>
+        </w:rPr>
+        <w:t>needed</w:t>
+      </w:r>
+      <w:proofErr w:type="gramEnd"/>
+      <w:r>
+        <w:rPr>
+          <w:sz w:val="20"/>
+          <w:szCs w:val="20"/>
+        </w:rPr>
+        <w:t xml:space="preserve"> and the project runs unchanged on any machine. A patient timeline merges appointments, records, and prescriptions into one ordered history that gives a clinician the full picture of a patient </w:t>
+      </w:r>
+      <w:proofErr w:type="gramStart"/>
+      <w:r>
+        <w:rPr>
+          <w:sz w:val="20"/>
+          <w:szCs w:val="20"/>
+        </w:rPr>
+        <w:t>at a glance</w:t>
+      </w:r>
+      <w:proofErr w:type="gramEnd"/>
+      <w:r>
+        <w:rPr>
+          <w:sz w:val="20"/>
+          <w:szCs w:val="20"/>
+        </w:rPr>
+        <w:t>. Running across all of these is an append-only audit trail that records every security and business action, such as a booking, a cancellation, a record change, or a report export, together with the user who performed it and the time it happened, giving the system a tamper-evident history that only administrators can view.</w:t>
       </w:r>
     </w:p>
     <w:p>
@@ -1435,7 +1717,39 @@
           <w:sz w:val="20"/>
           <w:szCs w:val="20"/>
         </w:rPr>
-        <w:t>The schema holds fifteen normalised tables defined across six migrations that run automatically the first time the server starts. Foreign keys, check constraints, and indexes enforce integrity inside the database rather than relying on application code alone, so the data stays valid even if a bug slips into a handler.</w:t>
+        <w:t xml:space="preserve">The </w:t>
+      </w:r>
+      <w:proofErr w:type="gramStart"/>
+      <w:r>
+        <w:rPr>
+          <w:sz w:val="20"/>
+          <w:szCs w:val="20"/>
+        </w:rPr>
+        <w:t>schema</w:t>
+      </w:r>
+      <w:proofErr w:type="gramEnd"/>
+      <w:r>
+        <w:rPr>
+          <w:sz w:val="20"/>
+          <w:szCs w:val="20"/>
+        </w:rPr>
+        <w:t xml:space="preserve"> holds fifteen normalised tables defined </w:t>
+      </w:r>
+      <w:proofErr w:type="gramStart"/>
+      <w:r>
+        <w:rPr>
+          <w:sz w:val="20"/>
+          <w:szCs w:val="20"/>
+        </w:rPr>
+        <w:t>across</w:t>
+      </w:r>
+      <w:proofErr w:type="gramEnd"/>
+      <w:r>
+        <w:rPr>
+          <w:sz w:val="20"/>
+          <w:szCs w:val="20"/>
+        </w:rPr>
+        <w:t xml:space="preserve"> six migrations that run automatically the first time the server starts. Foreign keys, check constraints, and indexes enforce integrity inside the database rather than relying on application code alone, so the data stays valid even if a bug slips into a handler.</w:t>
       </w:r>
     </w:p>
     <w:tbl>
@@ -1974,6 +2288,7 @@
           <w:sz w:val="24"/>
           <w:szCs w:val="24"/>
         </w:rPr>
+        <w:lastRenderedPageBreak/>
         <w:t>6. Security and Access Control</w:t>
       </w:r>
     </w:p>
@@ -1991,8 +2306,23 @@
           <w:sz w:val="20"/>
           <w:szCs w:val="20"/>
         </w:rPr>
-        <w:lastRenderedPageBreak/>
-        <w:t>Security was treated as a first-class concern rather than an afterthought. Passwords are stored only as bcrypt hashes with a fixed work factor, sessions are held in signed cookies so their contents cannot be tampered with, and the signing key is generated once and reused across restarts so users are not logged out on every restart. Access is controlled on two levels. Role guards decide who may reach a route, so only staff can open billing management and only an administrator can see the dashboard and the audit trail. Ownership checks then decide who may see a specific record, so a patient can open only their own appointments, invoices, and medical reports, and an attempt to reach another patient data returns a forbidden response instead of leaking it. Together with the timing-safe login and the append-only audit trail, these measures give the system a realistic security posture for handling sensitive health information.</w:t>
+        <w:t xml:space="preserve">Security was treated as a first-class concern rather than an afterthought. Passwords are stored only as bcrypt hashes with a fixed work factor, sessions are held in signed cookies so their contents cannot be tampered with, and the signing key is generated once and reused across </w:t>
+      </w:r>
+      <w:proofErr w:type="gramStart"/>
+      <w:r>
+        <w:rPr>
+          <w:sz w:val="20"/>
+          <w:szCs w:val="20"/>
+        </w:rPr>
+        <w:t>restarts</w:t>
+      </w:r>
+      <w:proofErr w:type="gramEnd"/>
+      <w:r>
+        <w:rPr>
+          <w:sz w:val="20"/>
+          <w:szCs w:val="20"/>
+        </w:rPr>
+        <w:t xml:space="preserve"> so users are not logged out on every restart. Access is controlled on two levels. Role guards decide who may reach a route, so only staff can open billing management and only an administrator can see the dashboard and the audit trail. Ownership checks then decide who may see a specific record, so a patient can open only their own appointments, invoices, and medical reports, and an attempt to reach another patient data returns a forbidden response instead of leaking it. Together with the timing-safe login and the append-only audit trail, these measures give the system a realistic security posture for handling sensitive health information.</w:t>
       </w:r>
     </w:p>
     <w:p>
@@ -2380,7 +2710,23 @@
           <w:sz w:val="20"/>
           <w:szCs w:val="20"/>
         </w:rPr>
-        <w:t xml:space="preserve"> Implemented three cooperating algorithms to make the scheduling engine safe and fair under load. Applied the interval-overlap test for standard conflict detection.</w:t>
+        <w:t xml:space="preserve"> Implemented three cooperating algorithms to make the scheduling engine safe and fair </w:t>
+      </w:r>
+      <w:proofErr w:type="gramStart"/>
+      <w:r>
+        <w:rPr>
+          <w:sz w:val="20"/>
+          <w:szCs w:val="20"/>
+        </w:rPr>
+        <w:t>under load</w:t>
+      </w:r>
+      <w:proofErr w:type="gramEnd"/>
+      <w:r>
+        <w:rPr>
+          <w:sz w:val="20"/>
+          <w:szCs w:val="20"/>
+        </w:rPr>
+        <w:t>. Applied the interval-overlap test for standard conflict detection.</w:t>
       </w:r>
     </w:p>
     <w:p>
@@ -2520,8 +2866,17 @@
           <w:sz w:val="20"/>
           <w:szCs w:val="20"/>
         </w:rPr>
-        <w:t>Built the availability module and doctor management tables, establishing the core structural boundaries for the clinic schedule .</w:t>
-      </w:r>
+        <w:t xml:space="preserve">Built the availability module and doctor management tables, establishing the core structural boundaries for the clinic </w:t>
+      </w:r>
+      <w:proofErr w:type="gramStart"/>
+      <w:r>
+        <w:rPr>
+          <w:sz w:val="20"/>
+          <w:szCs w:val="20"/>
+        </w:rPr>
+        <w:t>schedule .</w:t>
+      </w:r>
+      <w:proofErr w:type="gramEnd"/>
     </w:p>
     <w:p>
       <w:pPr>
@@ -2705,7 +3060,23 @@
           <w:sz w:val="20"/>
           <w:szCs w:val="20"/>
         </w:rPr>
-        <w:t xml:space="preserve">Built the medical records and prescription tracking modules, establishing the database models and clinical storage paths. </w:t>
+        <w:t xml:space="preserve">Built the medical records and prescription tracking modules, </w:t>
+      </w:r>
+      <w:proofErr w:type="gramStart"/>
+      <w:r>
+        <w:rPr>
+          <w:sz w:val="20"/>
+          <w:szCs w:val="20"/>
+        </w:rPr>
+        <w:t>establishing</w:t>
+      </w:r>
+      <w:proofErr w:type="gramEnd"/>
+      <w:r>
+        <w:rPr>
+          <w:sz w:val="20"/>
+          <w:szCs w:val="20"/>
+        </w:rPr>
+        <w:t xml:space="preserve"> the database models and clinical storage paths. </w:t>
       </w:r>
     </w:p>
     <w:p>
@@ -2909,6 +3280,7 @@
           <w:sz w:val="20"/>
           <w:szCs w:val="20"/>
         </w:rPr>
+        <w:lastRenderedPageBreak/>
         <w:t>Individual Extended Features &amp; Technical Contributions:</w:t>
       </w:r>
     </w:p>
@@ -2928,7 +3300,6 @@
           <w:sz w:val="20"/>
           <w:szCs w:val="20"/>
         </w:rPr>
-        <w:lastRenderedPageBreak/>
         <w:t>Clinic Analytics Dashboard:</w:t>
       </w:r>
       <w:r>
@@ -3048,7 +3419,39 @@
           <w:sz w:val="20"/>
           <w:szCs w:val="20"/>
         </w:rPr>
-        <w:t>The system is covered by 188 automated tests, made up of 132 integration tests that drive the real HTTP routes against an in-memory database and 56 unit tests for pure logic such as overlap maths, gap finding, and PDF word wrapping. Every test runs with no external setup, which made regression checking fast and reliable throughout development and gave us the confidence to refactor.</w:t>
+        <w:t xml:space="preserve">The system is covered by 195 automated tests, made up of 137 integration tests that drive the real HTTP routes against an in-memory database and </w:t>
+      </w:r>
+      <w:proofErr w:type="gramStart"/>
+      <w:r>
+        <w:rPr>
+          <w:sz w:val="20"/>
+          <w:szCs w:val="20"/>
+        </w:rPr>
+        <w:t>58 unit</w:t>
+      </w:r>
+      <w:proofErr w:type="gramEnd"/>
+      <w:r>
+        <w:rPr>
+          <w:sz w:val="20"/>
+          <w:szCs w:val="20"/>
+        </w:rPr>
+        <w:t xml:space="preserve"> tests for pure logic such as overlap maths, gap finding, and PDF word wrapping. Every test runs with no external setup, which made regression checking fast and reliable throughout development and gave us </w:t>
+      </w:r>
+      <w:proofErr w:type="gramStart"/>
+      <w:r>
+        <w:rPr>
+          <w:sz w:val="20"/>
+          <w:szCs w:val="20"/>
+        </w:rPr>
+        <w:t>the confidence</w:t>
+      </w:r>
+      <w:proofErr w:type="gramEnd"/>
+      <w:r>
+        <w:rPr>
+          <w:sz w:val="20"/>
+          <w:szCs w:val="20"/>
+        </w:rPr>
+        <w:t xml:space="preserve"> to refactor.</w:t>
       </w:r>
     </w:p>
     <w:p>
@@ -3195,6 +3598,7 @@
                 <w:szCs w:val="18"/>
               </w:rPr>
             </w:pPr>
+            <w:proofErr w:type="gramStart"/>
             <w:r>
               <w:rPr>
                 <w:b/>
@@ -3205,6 +3609,7 @@
               </w:rPr>
               <w:t>Main focus</w:t>
             </w:r>
+            <w:proofErr w:type="gramEnd"/>
           </w:p>
         </w:tc>
       </w:tr>
@@ -3270,13 +3675,24 @@
                 <w:szCs w:val="18"/>
               </w:rPr>
             </w:pPr>
-            <w:r>
-              <w:rPr>
-                <w:sz w:val="18"/>
-                <w:szCs w:val="18"/>
-              </w:rPr>
-              <w:t>56</w:t>
-            </w:r>
+            <w:del w:id="2" w:author="Claude" w:date="2026-07-05T00:00:00Z">
+              <w:r>
+                <w:rPr>
+                  <w:sz w:val="18"/>
+                  <w:szCs w:val="18"/>
+                </w:rPr>
+                <w:delText>56</w:delText>
+              </w:r>
+            </w:del>
+            <w:ins w:id="3" w:author="Claude" w:date="2026-07-05T00:00:00Z">
+              <w:r>
+                <w:rPr>
+                  <w:sz w:val="18"/>
+                  <w:szCs w:val="18"/>
+                </w:rPr>
+                <w:t>58</w:t>
+              </w:r>
+            </w:ins>
           </w:p>
         </w:tc>
         <w:tc>
@@ -3591,13 +4007,24 @@
                 <w:szCs w:val="18"/>
               </w:rPr>
             </w:pPr>
-            <w:r>
-              <w:rPr>
-                <w:sz w:val="18"/>
-                <w:szCs w:val="18"/>
-              </w:rPr>
-              <w:t>30</w:t>
-            </w:r>
+            <w:del w:id="4" w:author="Claude" w:date="2026-07-05T00:00:00Z">
+              <w:r>
+                <w:rPr>
+                  <w:sz w:val="18"/>
+                  <w:szCs w:val="18"/>
+                </w:rPr>
+                <w:delText>30</w:delText>
+              </w:r>
+            </w:del>
+            <w:ins w:id="5" w:author="Claude" w:date="2026-07-05T00:00:00Z">
+              <w:r>
+                <w:rPr>
+                  <w:sz w:val="18"/>
+                  <w:szCs w:val="18"/>
+                </w:rPr>
+                <w:t>35</w:t>
+              </w:r>
+            </w:ins>
           </w:p>
         </w:tc>
         <w:tc>
@@ -3626,13 +4053,24 @@
                 <w:szCs w:val="18"/>
               </w:rPr>
             </w:pPr>
-            <w:r>
-              <w:rPr>
-                <w:sz w:val="18"/>
-                <w:szCs w:val="18"/>
-              </w:rPr>
-              <w:t>Booking, priority booking, cancellation, and waitlist over HTTP.</w:t>
-            </w:r>
+            <w:del w:id="6" w:author="Claude" w:date="2026-07-05T00:00:00Z">
+              <w:r>
+                <w:rPr>
+                  <w:sz w:val="18"/>
+                  <w:szCs w:val="18"/>
+                </w:rPr>
+                <w:delText>Booking, priority booking, cancellation, and waitlist over HTTP.</w:delText>
+              </w:r>
+            </w:del>
+            <w:ins w:id="7" w:author="Claude" w:date="2026-07-05T00:00:00Z">
+              <w:r>
+                <w:rPr>
+                  <w:sz w:val="18"/>
+                  <w:szCs w:val="18"/>
+                </w:rPr>
+                <w:t>Booking, priority booking, cancellation, and waitlist over HTTP, including the auto‑reschedule‑on‑bump and expiry lifecycle.</w:t>
+              </w:r>
+            </w:ins>
           </w:p>
         </w:tc>
       </w:tr>
@@ -4088,24 +4526,55 @@
           <w:sz w:val="20"/>
           <w:szCs w:val="20"/>
         </w:rPr>
-        <w:t>Building the system taught us a clear lesson about where to put guarantees. Each time we tried to enforce a rule with careful code inside a handler, such as checking for a clash before inserting a booking, an edge case or a race eventually slipped through. The fixes that lasted were the ones that moved the guarantee into the type system or the database, where it holds for every path on its own. That was true of the unique index that makes double booking impossible, the typed role enum that turns an unhandled privilege into a compile error, and the transaction that makes a half-finished priority override roll back by itself. If we were to extend the project, the same principle would guide the next features, starting with email notifications for waitlist offers and a calendar export, both of which fit cleanly behind the existing service layer without touching the correctness core.</w:t>
-      </w:r>
-    </w:p>
-    <w:p>
-      <w:pPr>
-        <w:spacing w:after="80" w:line="264" w:lineRule="auto"/>
-        <w:jc w:val="both"/>
-        <w:rPr>
-          <w:sz w:val="20"/>
-          <w:szCs w:val="20"/>
-        </w:rPr>
-      </w:pPr>
-      <w:r>
-        <w:rPr>
-          <w:sz w:val="20"/>
-          <w:szCs w:val="20"/>
-        </w:rPr>
-        <w:t>In conclusion, our system delivers a clinic management portal built around a reliable scheduling engine, database-enforced concurrency rules, and distinct extended modules that provide real operational depth. The result is a system that is reliable, easy to extend, and faithful to the way a real clinic actually operates.</w:t>
+        <w:t xml:space="preserve">Building the system reinforced one lesson: guarantees that </w:t>
+      </w:r>
+      <w:proofErr w:type="gramStart"/>
+      <w:r>
+        <w:rPr>
+          <w:sz w:val="20"/>
+          <w:szCs w:val="20"/>
+        </w:rPr>
+        <w:t>last are the</w:t>
+      </w:r>
+      <w:proofErr w:type="gramEnd"/>
+      <w:r>
+        <w:rPr>
+          <w:sz w:val="20"/>
+          <w:szCs w:val="20"/>
+        </w:rPr>
+        <w:t xml:space="preserve"> ones </w:t>
+      </w:r>
+      <w:proofErr w:type="gramStart"/>
+      <w:r>
+        <w:rPr>
+          <w:sz w:val="20"/>
+          <w:szCs w:val="20"/>
+        </w:rPr>
+        <w:t>pushed</w:t>
+      </w:r>
+      <w:proofErr w:type="gramEnd"/>
+      <w:r>
+        <w:rPr>
+          <w:sz w:val="20"/>
+          <w:szCs w:val="20"/>
+        </w:rPr>
+        <w:t xml:space="preserve"> into the type system or the database, not careful handler-level code where edge cases and races eventually slip through. That is true of the unique index that makes double booking impossible, the typed role enum that turns an unhandled privilege into a compile error, and the transaction that rolls back a half-finished priority override by itself. Extending the project with email notifications for waitlist offers or a calendar export would follow the same principle behind the existing service layer. In conclusion, the system delivers a clinic management portal built around a reliable scheduling engine, database-enforced concurrency, and distinct extended modules with real operational depth: reliable, easy to extend, and faithful to how a clinic </w:t>
+      </w:r>
+      <w:proofErr w:type="gramStart"/>
+      <w:r>
+        <w:rPr>
+          <w:sz w:val="20"/>
+          <w:szCs w:val="20"/>
+        </w:rPr>
+        <w:t>actually operates</w:t>
+      </w:r>
+      <w:proofErr w:type="gramEnd"/>
+      <w:r>
+        <w:rPr>
+          <w:sz w:val="20"/>
+          <w:szCs w:val="20"/>
+        </w:rPr>
+        <w:t>.</w:t>
       </w:r>
     </w:p>
     <w:sectPr>

</xml_diff>

<commit_message>
feat: add password change and invoice cancellation, clean up code comments - Add self-service password change (current-password check) and admin reset flow at /users/{id}/change-password - Add invoice cancel/void for pending invoices at POST /billing/{id}/cancel (admin-only), completing the pending/paid/cancelled state machine - Rewrite module doc comments across src/ (drop //! blocks, markdown tables, em dashes) so they read as plain human notes - Sync README and report test counts/feature lists with the two new features (219 tests, 9 suites)
</commit_message>
<xml_diff>
--- a/WebProgrammingReport_final.docx
+++ b/WebProgrammingReport_final.docx
@@ -2271,7 +2271,7 @@
           <w:sz w:val="20"/>
           <w:szCs w:val="20"/>
         </w:rPr>
-        <w:t>The user interface is generated on the server using Tera templates with layout inheritance. A single layout file defines the main structure and navigation bars, allowing the 27 individual page templates to remain light and clean. We used the Bulma framework to make the layout fully responsive across mobile and desktop devices. The navigation menus adjust dynamically based on user roles, hiding restricted links from patients while displaying administrative management pages only to staff.</w:t>
+        <w:t>The user interface is generated on the server using Tera templates with layout inheritance. A single layout file defines the main structure and navigation bars, allowing the 28 individual page templates to remain light and clean. We used the Bulma framework to make the layout fully responsive across mobile and desktop devices. The navigation menus adjust dynamically based on user roles, hiding restricted links from patients while displaying administrative management pages only to staff.</w:t>
       </w:r>
     </w:p>
     <w:p>
@@ -3419,7 +3419,7 @@
           <w:sz w:val="20"/>
           <w:szCs w:val="20"/>
         </w:rPr>
-        <w:t xml:space="preserve">The system is covered by 195 automated tests, made up of 137 integration tests that drive the real HTTP routes against an in-memory database and </w:t>
+        <w:t xml:space="preserve">The system is covered by 207 automated tests, made up of 149 integration tests that drive the real HTTP routes against an in-memory database and </w:t>
       </w:r>
       <w:proofErr w:type="gramStart"/>
       <w:r>

</xml_diff>

<commit_message>
Refactor appointment booking and waitlist handling
- Added a `today` variable to the booking context to set the minimum date for appointment booking.
- Consolidated audit logging for auto-rescheduled appointments into a shared function.
- Improved database queries for fetching doctor availability rules, batching requests for efficiency.
- Updated error handling to differentiate between general bad requests and specific slot conflicts.
- Enhanced user experience in templates by adding ARIA labels for accessibility.
- Refactored patient appointment ownership checks into a reusable function to reduce code duplication.
- Improved error handling during database pool creation and migration execution.
- Added new timeline event functions to build a patient's timeline from various sources.
- Updated tests to reflect changes in the booking form rendering.
</commit_message>
<xml_diff>
--- a/WebProgrammingReport_final.docx
+++ b/WebProgrammingReport_final.docx
@@ -35,25 +35,7 @@
           <w:bCs/>
           <w:color w:val="2E86C1"/>
         </w:rPr>
-        <w:t xml:space="preserve">Project </w:t>
-      </w:r>
-      <w:proofErr w:type="gramStart"/>
-      <w:r>
-        <w:rPr>
-          <w:b/>
-          <w:bCs/>
-          <w:color w:val="2E86C1"/>
-        </w:rPr>
-        <w:t>Report  |</w:t>
-      </w:r>
-      <w:proofErr w:type="gramEnd"/>
-      <w:r>
-        <w:rPr>
-          <w:b/>
-          <w:bCs/>
-          <w:color w:val="2E86C1"/>
-        </w:rPr>
-        <w:t xml:space="preserve">  CSC1106 Web Programming</w:t>
+        <w:t>Project Report  |  CSC1106 Web Programming</w:t>
       </w:r>
     </w:p>
     <w:p>
@@ -90,79 +72,7 @@
           <w:sz w:val="16"/>
           <w:szCs w:val="16"/>
         </w:rPr>
-        <w:t xml:space="preserve">Team Members:  Muhammad ‘Afif Bin Muhd Lotfi </w:t>
-      </w:r>
-      <w:proofErr w:type="gramStart"/>
-      <w:r>
-        <w:rPr>
-          <w:color w:val="7F7F7F"/>
-          <w:sz w:val="16"/>
-          <w:szCs w:val="16"/>
-        </w:rPr>
-        <w:t>Jarhom,  Dylan</w:t>
-      </w:r>
-      <w:proofErr w:type="gramEnd"/>
-      <w:r>
-        <w:rPr>
-          <w:color w:val="7F7F7F"/>
-          <w:sz w:val="16"/>
-          <w:szCs w:val="16"/>
-        </w:rPr>
-        <w:t xml:space="preserve"> Ho Sheng Xue (3178143H</w:t>
-      </w:r>
-      <w:proofErr w:type="gramStart"/>
-      <w:r>
-        <w:rPr>
-          <w:color w:val="7F7F7F"/>
-          <w:sz w:val="16"/>
-          <w:szCs w:val="16"/>
-        </w:rPr>
-        <w:t>),  Hanzalah</w:t>
-      </w:r>
-      <w:proofErr w:type="gramEnd"/>
-      <w:r>
-        <w:rPr>
-          <w:color w:val="7F7F7F"/>
-          <w:sz w:val="16"/>
-          <w:szCs w:val="16"/>
-        </w:rPr>
-        <w:t xml:space="preserve"> Bin Mohamad </w:t>
-      </w:r>
-      <w:proofErr w:type="gramStart"/>
-      <w:r>
-        <w:rPr>
-          <w:color w:val="7F7F7F"/>
-          <w:sz w:val="16"/>
-          <w:szCs w:val="16"/>
-        </w:rPr>
-        <w:t>Hisam ,</w:t>
-      </w:r>
-      <w:proofErr w:type="gramEnd"/>
-      <w:r>
-        <w:rPr>
-          <w:color w:val="7F7F7F"/>
-          <w:sz w:val="16"/>
-          <w:szCs w:val="16"/>
-        </w:rPr>
-        <w:t xml:space="preserve">  Lennon Lim Le </w:t>
-      </w:r>
-      <w:proofErr w:type="gramStart"/>
-      <w:r>
-        <w:rPr>
-          <w:color w:val="7F7F7F"/>
-          <w:sz w:val="16"/>
-          <w:szCs w:val="16"/>
-        </w:rPr>
-        <w:t>Rong,  Muhammad</w:t>
-      </w:r>
-      <w:proofErr w:type="gramEnd"/>
-      <w:r>
-        <w:rPr>
-          <w:color w:val="7F7F7F"/>
-          <w:sz w:val="16"/>
-          <w:szCs w:val="16"/>
-        </w:rPr>
-        <w:t xml:space="preserve"> Raees Irfan Bin Ishak </w:t>
+        <w:t xml:space="preserve">Team Members:  Muhammad ‘Afif Bin Muhd Lotfi Jarhom,  Dylan Ho Sheng Xue (3178143H),  Hanzalah Bin Mohamad Hisam ,  Lennon Lim Le Rong,  Muhammad Raees Irfan Bin Ishak </w:t>
       </w:r>
     </w:p>
     <w:p>
@@ -213,23 +123,7 @@
           <w:sz w:val="20"/>
           <w:szCs w:val="20"/>
         </w:rPr>
-        <w:t xml:space="preserve">Leveraging Rust ensures memory safety and exhaustive compile-time error </w:t>
-      </w:r>
-      <w:proofErr w:type="gramStart"/>
-      <w:r>
-        <w:rPr>
-          <w:sz w:val="20"/>
-          <w:szCs w:val="20"/>
-        </w:rPr>
-        <w:t>handling ,</w:t>
-      </w:r>
-      <w:proofErr w:type="gramEnd"/>
-      <w:r>
-        <w:rPr>
-          <w:sz w:val="20"/>
-          <w:szCs w:val="20"/>
-        </w:rPr>
-        <w:t xml:space="preserve"> while server-side rendering via the Tera template engine centralizes validation trust, keeping request flows straightforward and audit-safe. The implementation follows a strict validation-first pipeline: every write request verifies input data prior to SQL execution, and operations spanning multiple tables are wrapped inside database transactions to prevent partial writes. Incremental feature delivery alongside automated regression testing guarantees system stability across all operational paths.</w:t>
+        <w:t>Leveraging Rust ensures memory safety and exhaustive compile-time error handling , while server-side rendering via the Tera template engine centralizes validation trust, keeping request flows straightforward and audit-safe. The implementation follows a strict validation-first pipeline: every write request verifies input data prior to SQL execution, and operations spanning multiple tables are wrapped inside database transactions to prevent partial writes. Incremental feature delivery alongside automated regression testing guarantees system stability across all operational paths.</w:t>
       </w:r>
     </w:p>
     <w:p>
@@ -339,79 +233,7 @@
           <w:sz w:val="18"/>
           <w:szCs w:val="18"/>
         </w:rPr>
-        <w:t xml:space="preserve">HTTP </w:t>
-      </w:r>
-      <w:proofErr w:type="gramStart"/>
-      <w:r>
-        <w:rPr>
-          <w:rFonts w:ascii="Cardo" w:eastAsia="Cardo" w:hAnsi="Cardo" w:cs="Cardo"/>
-          <w:b/>
-          <w:bCs/>
-          <w:color w:val="1A5276"/>
-          <w:sz w:val="18"/>
-          <w:szCs w:val="18"/>
-        </w:rPr>
-        <w:t>route  →</w:t>
-      </w:r>
-      <w:proofErr w:type="gramEnd"/>
-      <w:r>
-        <w:rPr>
-          <w:rFonts w:ascii="Cardo" w:eastAsia="Cardo" w:hAnsi="Cardo" w:cs="Cardo"/>
-          <w:b/>
-          <w:bCs/>
-          <w:color w:val="1A5276"/>
-          <w:sz w:val="18"/>
-          <w:szCs w:val="18"/>
-        </w:rPr>
-        <w:t xml:space="preserve">  Form </w:t>
-      </w:r>
-      <w:proofErr w:type="gramStart"/>
-      <w:r>
-        <w:rPr>
-          <w:rFonts w:ascii="Cardo" w:eastAsia="Cardo" w:hAnsi="Cardo" w:cs="Cardo"/>
-          <w:b/>
-          <w:bCs/>
-          <w:color w:val="1A5276"/>
-          <w:sz w:val="18"/>
-          <w:szCs w:val="18"/>
-        </w:rPr>
-        <w:t>validation  →</w:t>
-      </w:r>
-      <w:proofErr w:type="gramEnd"/>
-      <w:r>
-        <w:rPr>
-          <w:rFonts w:ascii="Cardo" w:eastAsia="Cardo" w:hAnsi="Cardo" w:cs="Cardo"/>
-          <w:b/>
-          <w:bCs/>
-          <w:color w:val="1A5276"/>
-          <w:sz w:val="18"/>
-          <w:szCs w:val="18"/>
-        </w:rPr>
-        <w:t xml:space="preserve">  Service and database </w:t>
-      </w:r>
-      <w:proofErr w:type="gramStart"/>
-      <w:r>
-        <w:rPr>
-          <w:rFonts w:ascii="Cardo" w:eastAsia="Cardo" w:hAnsi="Cardo" w:cs="Cardo"/>
-          <w:b/>
-          <w:bCs/>
-          <w:color w:val="1A5276"/>
-          <w:sz w:val="18"/>
-          <w:szCs w:val="18"/>
-        </w:rPr>
-        <w:t>transaction  →</w:t>
-      </w:r>
-      <w:proofErr w:type="gramEnd"/>
-      <w:r>
-        <w:rPr>
-          <w:rFonts w:ascii="Cardo" w:eastAsia="Cardo" w:hAnsi="Cardo" w:cs="Cardo"/>
-          <w:b/>
-          <w:bCs/>
-          <w:color w:val="1A5276"/>
-          <w:sz w:val="18"/>
-          <w:szCs w:val="18"/>
-        </w:rPr>
-        <w:t xml:space="preserve">  Rendered page or redirect</w:t>
+        <w:t>HTTP route  →  Form validation  →  Service and database transaction  →  Rendered page or redirect</w:t>
       </w:r>
     </w:p>
     <w:p>
@@ -1106,23 +928,7 @@
           <w:sz w:val="20"/>
           <w:szCs w:val="20"/>
         </w:rPr>
-        <w:t xml:space="preserve"> type only permits a cancellation or a reassignment while it is still scheduled, which makes an invalid state change impossible to express. Error handling is unified through a single application error type with eight variants that implements </w:t>
-      </w:r>
-      <w:proofErr w:type="gramStart"/>
-      <w:r>
-        <w:rPr>
-          <w:sz w:val="20"/>
-          <w:szCs w:val="20"/>
-        </w:rPr>
-        <w:t>the framework</w:t>
-      </w:r>
-      <w:proofErr w:type="gramEnd"/>
-      <w:r>
-        <w:rPr>
-          <w:sz w:val="20"/>
-          <w:szCs w:val="20"/>
-        </w:rPr>
-        <w:t xml:space="preserve"> ResponseError trait. Because every lower-level failure, whether from the database, the template engine, or the password library, converts into this one type, handlers can use the </w:t>
+        <w:t xml:space="preserve"> type only permits a cancellation or a reassignment while it is still scheduled, which makes an invalid state change impossible to express. Error handling is unified through a single application error type with eight variants that implements the framework ResponseError trait. Because every lower-level failure, whether from the database, the template engine, or the password library, converts into this one type, handlers can use the </w:t>
       </w:r>
       <w:r>
         <w:rPr>
@@ -1414,23 +1220,7 @@
           <w:sz w:val="20"/>
           <w:szCs w:val="20"/>
         </w:rPr>
-        <w:t xml:space="preserve">When a booking is made, the system confirms the time falls within the clinic's operating hours, checks availability rules, and looks for overlaps. If the slot is open, the system assigns a room and saves the booking inside a database transaction. If the slot is taken, a patient’s request is rejected with an </w:t>
-      </w:r>
-      <w:proofErr w:type="gramStart"/>
-      <w:r>
-        <w:rPr>
-          <w:sz w:val="20"/>
-          <w:szCs w:val="20"/>
-        </w:rPr>
-        <w:t>alternative-slot</w:t>
-      </w:r>
-      <w:proofErr w:type="gramEnd"/>
-      <w:r>
-        <w:rPr>
-          <w:sz w:val="20"/>
-          <w:szCs w:val="20"/>
-        </w:rPr>
-        <w:t xml:space="preserve"> suggestion, while staff bookings follow the priority decision rules in Figure 2:</w:t>
+        <w:t>When a booking is made, the system confirms the time falls within the clinic's operating hours, checks availability rules, and looks for overlaps. If the slot is open, the system assigns a room and saves the booking inside a database transaction. If the slot is taken, a patient’s request is rejected with an alternative-slot suggestion, while staff bookings follow the priority decision rules in Figure 2:</w:t>
       </w:r>
     </w:p>
     <w:p>
@@ -1526,23 +1316,7 @@
           <w:sz w:val="20"/>
           <w:szCs w:val="20"/>
         </w:rPr>
-        <w:t xml:space="preserve">The waitlist is a small state machine that keeps the schedule busy, shown in Figure 3. A cancellation frees a slot and auto‑promotes the most urgent waiter. A priority override instead </w:t>
-      </w:r>
-      <w:proofErr w:type="gramStart"/>
-      <w:r>
-        <w:rPr>
-          <w:sz w:val="20"/>
-          <w:szCs w:val="20"/>
-        </w:rPr>
-        <w:t>searches</w:t>
-      </w:r>
-      <w:proofErr w:type="gramEnd"/>
-      <w:r>
-        <w:rPr>
-          <w:sz w:val="20"/>
-          <w:szCs w:val="20"/>
-        </w:rPr>
-        <w:t xml:space="preserve"> the same doctor’s day for the next open gap and rebooks the displaced patient there, only falling back to waiting when the day is genuinely full. An entry whose requested time passes while still waiting is automatically swept to expired.</w:t>
+        <w:t>The waitlist is a small state machine that keeps the schedule busy, shown in Figure 3. A cancellation frees a slot and auto‑promotes the most urgent waiter. A priority override instead searches the same doctor’s day for the next open gap and rebooks the displaced patient there, only falling back to waiting when the day is genuinely full. An entry whose requested time passes while still waiting is automatically swept to expired.</w:t>
       </w:r>
     </w:p>
     <w:p>
@@ -1634,39 +1408,7 @@
           <w:sz w:val="20"/>
           <w:szCs w:val="20"/>
         </w:rPr>
-        <w:t xml:space="preserve">Two further features add breadth. Medical reports are exported to PDF entirely in Rust using the printpdf crate, with manual page layout, word wrapping, and automatic pagination, so no external program or font file is </w:t>
-      </w:r>
-      <w:proofErr w:type="gramStart"/>
-      <w:r>
-        <w:rPr>
-          <w:sz w:val="20"/>
-          <w:szCs w:val="20"/>
-        </w:rPr>
-        <w:t>needed</w:t>
-      </w:r>
-      <w:proofErr w:type="gramEnd"/>
-      <w:r>
-        <w:rPr>
-          <w:sz w:val="20"/>
-          <w:szCs w:val="20"/>
-        </w:rPr>
-        <w:t xml:space="preserve"> and the project runs unchanged on any machine. A patient timeline merges appointments, records, and prescriptions into one ordered history that gives a clinician the full picture of a patient </w:t>
-      </w:r>
-      <w:proofErr w:type="gramStart"/>
-      <w:r>
-        <w:rPr>
-          <w:sz w:val="20"/>
-          <w:szCs w:val="20"/>
-        </w:rPr>
-        <w:t>at a glance</w:t>
-      </w:r>
-      <w:proofErr w:type="gramEnd"/>
-      <w:r>
-        <w:rPr>
-          <w:sz w:val="20"/>
-          <w:szCs w:val="20"/>
-        </w:rPr>
-        <w:t>. Running across all of these is an append-only audit trail that records every security and business action, such as a booking, a cancellation, a record change, or a report export, together with the user who performed it and the time it happened, giving the system a tamper-evident history that only administrators can view.</w:t>
+        <w:t>Two further features add breadth. Medical reports are exported to PDF entirely in Rust using the printpdf crate, with manual page layout, word wrapping, and automatic pagination, so no external program or font file is needed and the project runs unchanged on any machine. A patient timeline merges appointments, records, and prescriptions into one ordered history that gives a clinician the full picture of a patient at a glance. Running across all of these is an append-only audit trail that records every security and business action, such as a booking, a cancellation, a record change, or a report export, together with the user who performed it and the time it happened, giving the system a tamper-evident history that only administrators can view.</w:t>
       </w:r>
     </w:p>
     <w:p>
@@ -1717,39 +1459,32 @@
           <w:sz w:val="20"/>
           <w:szCs w:val="20"/>
         </w:rPr>
-        <w:t xml:space="preserve">The </w:t>
-      </w:r>
-      <w:proofErr w:type="gramStart"/>
-      <w:r>
-        <w:rPr>
-          <w:sz w:val="20"/>
-          <w:szCs w:val="20"/>
-        </w:rPr>
-        <w:t>schema</w:t>
-      </w:r>
-      <w:proofErr w:type="gramEnd"/>
-      <w:r>
-        <w:rPr>
-          <w:sz w:val="20"/>
-          <w:szCs w:val="20"/>
-        </w:rPr>
-        <w:t xml:space="preserve"> holds fifteen normalised tables defined </w:t>
-      </w:r>
-      <w:proofErr w:type="gramStart"/>
-      <w:r>
-        <w:rPr>
-          <w:sz w:val="20"/>
-          <w:szCs w:val="20"/>
-        </w:rPr>
-        <w:t>across</w:t>
-      </w:r>
-      <w:proofErr w:type="gramEnd"/>
-      <w:r>
-        <w:rPr>
-          <w:sz w:val="20"/>
-          <w:szCs w:val="20"/>
-        </w:rPr>
-        <w:t xml:space="preserve"> six migrations that run automatically the first time the server starts. Foreign keys, check constraints, and indexes enforce integrity inside the database rather than relying on application code alone, so the data stays valid even if a bug slips into a handler.</w:t>
+        <w:t xml:space="preserve">The schema holds fifteen normalised tables defined across </w:t>
+      </w:r>
+      <w:del w:id="2" w:author="Claude" w:date="2026-07-06T00:00:00Z">
+        <w:r>
+          <w:rPr>
+            <w:sz w:val="20"/>
+            <w:szCs w:val="20"/>
+          </w:rPr>
+          <w:delText>six</w:delText>
+        </w:r>
+      </w:del>
+      <w:ins w:id="3" w:author="Claude" w:date="2026-07-06T00:00:00Z">
+        <w:r>
+          <w:rPr>
+            <w:sz w:val="20"/>
+            <w:szCs w:val="20"/>
+          </w:rPr>
+          <w:t>eight</w:t>
+        </w:r>
+      </w:ins>
+      <w:r>
+        <w:rPr>
+          <w:sz w:val="20"/>
+          <w:szCs w:val="20"/>
+        </w:rPr>
+        <w:t xml:space="preserve"> migrations that run automatically the first time the server starts. Foreign keys, check constraints, and indexes enforce integrity inside the database rather than relying on application code alone, so the data stays valid even if a bug slips into a handler.</w:t>
       </w:r>
     </w:p>
     <w:tbl>
@@ -2306,23 +2041,7 @@
           <w:sz w:val="20"/>
           <w:szCs w:val="20"/>
         </w:rPr>
-        <w:t xml:space="preserve">Security was treated as a first-class concern rather than an afterthought. Passwords are stored only as bcrypt hashes with a fixed work factor, sessions are held in signed cookies so their contents cannot be tampered with, and the signing key is generated once and reused across </w:t>
-      </w:r>
-      <w:proofErr w:type="gramStart"/>
-      <w:r>
-        <w:rPr>
-          <w:sz w:val="20"/>
-          <w:szCs w:val="20"/>
-        </w:rPr>
-        <w:t>restarts</w:t>
-      </w:r>
-      <w:proofErr w:type="gramEnd"/>
-      <w:r>
-        <w:rPr>
-          <w:sz w:val="20"/>
-          <w:szCs w:val="20"/>
-        </w:rPr>
-        <w:t xml:space="preserve"> so users are not logged out on every restart. Access is controlled on two levels. Role guards decide who may reach a route, so only staff can open billing management and only an administrator can see the dashboard and the audit trail. Ownership checks then decide who may see a specific record, so a patient can open only their own appointments, invoices, and medical reports, and an attempt to reach another patient data returns a forbidden response instead of leaking it. Together with the timing-safe login and the append-only audit trail, these measures give the system a realistic security posture for handling sensitive health information.</w:t>
+        <w:t>Security was treated as a first-class concern rather than an afterthought. Passwords are stored only as bcrypt hashes with a fixed work factor, sessions are held in signed cookies so their contents cannot be tampered with, and the signing key is generated once and reused across restarts so users are not logged out on every restart. Access is controlled on two levels. Role guards decide who may reach a route, so only staff can open billing management and only an administrator can see the dashboard and the audit trail. Ownership checks then decide who may see a specific record, so a patient can open only their own appointments, invoices, and medical reports, and an attempt to reach another patient data returns a forbidden response instead of leaking it. Together with the timing-safe login and the append-only audit trail, these measures give the system a realistic security posture for handling sensitive health information.</w:t>
       </w:r>
     </w:p>
     <w:p>
@@ -2710,23 +2429,7 @@
           <w:sz w:val="20"/>
           <w:szCs w:val="20"/>
         </w:rPr>
-        <w:t xml:space="preserve"> Implemented three cooperating algorithms to make the scheduling engine safe and fair </w:t>
-      </w:r>
-      <w:proofErr w:type="gramStart"/>
-      <w:r>
-        <w:rPr>
-          <w:sz w:val="20"/>
-          <w:szCs w:val="20"/>
-        </w:rPr>
-        <w:t>under load</w:t>
-      </w:r>
-      <w:proofErr w:type="gramEnd"/>
-      <w:r>
-        <w:rPr>
-          <w:sz w:val="20"/>
-          <w:szCs w:val="20"/>
-        </w:rPr>
-        <w:t>. Applied the interval-overlap test for standard conflict detection.</w:t>
+        <w:t xml:space="preserve"> Implemented three cooperating algorithms to make the scheduling engine safe and fair under load. Applied the interval-overlap test for standard conflict detection.</w:t>
       </w:r>
     </w:p>
     <w:p>
@@ -2866,17 +2569,8 @@
           <w:sz w:val="20"/>
           <w:szCs w:val="20"/>
         </w:rPr>
-        <w:t xml:space="preserve">Built the availability module and doctor management tables, establishing the core structural boundaries for the clinic </w:t>
-      </w:r>
-      <w:proofErr w:type="gramStart"/>
-      <w:r>
-        <w:rPr>
-          <w:sz w:val="20"/>
-          <w:szCs w:val="20"/>
-        </w:rPr>
-        <w:t>schedule .</w:t>
-      </w:r>
-      <w:proofErr w:type="gramEnd"/>
+        <w:t>Built the availability module and doctor management tables, establishing the core structural boundaries for the clinic schedule .</w:t>
+      </w:r>
     </w:p>
     <w:p>
       <w:pPr>
@@ -3060,23 +2754,7 @@
           <w:sz w:val="20"/>
           <w:szCs w:val="20"/>
         </w:rPr>
-        <w:t xml:space="preserve">Built the medical records and prescription tracking modules, </w:t>
-      </w:r>
-      <w:proofErr w:type="gramStart"/>
-      <w:r>
-        <w:rPr>
-          <w:sz w:val="20"/>
-          <w:szCs w:val="20"/>
-        </w:rPr>
-        <w:t>establishing</w:t>
-      </w:r>
-      <w:proofErr w:type="gramEnd"/>
-      <w:r>
-        <w:rPr>
-          <w:sz w:val="20"/>
-          <w:szCs w:val="20"/>
-        </w:rPr>
-        <w:t xml:space="preserve"> the database models and clinical storage paths. </w:t>
+        <w:t xml:space="preserve">Built the medical records and prescription tracking modules, establishing the database models and clinical storage paths. </w:t>
       </w:r>
     </w:p>
     <w:p>
@@ -3419,39 +3097,82 @@
           <w:sz w:val="20"/>
           <w:szCs w:val="20"/>
         </w:rPr>
-        <w:t xml:space="preserve">The system is covered by 207 automated tests, made up of 149 integration tests that drive the real HTTP routes against an in-memory database and </w:t>
-      </w:r>
-      <w:proofErr w:type="gramStart"/>
-      <w:r>
-        <w:rPr>
-          <w:sz w:val="20"/>
-          <w:szCs w:val="20"/>
-        </w:rPr>
-        <w:t>58 unit</w:t>
-      </w:r>
-      <w:proofErr w:type="gramEnd"/>
-      <w:r>
-        <w:rPr>
-          <w:sz w:val="20"/>
-          <w:szCs w:val="20"/>
-        </w:rPr>
-        <w:t xml:space="preserve"> tests for pure logic such as overlap maths, gap finding, and PDF word wrapping. Every test runs with no external setup, which made regression checking fast and reliable throughout development and gave us </w:t>
-      </w:r>
-      <w:proofErr w:type="gramStart"/>
-      <w:r>
-        <w:rPr>
-          <w:sz w:val="20"/>
-          <w:szCs w:val="20"/>
-        </w:rPr>
-        <w:t>the confidence</w:t>
-      </w:r>
-      <w:proofErr w:type="gramEnd"/>
-      <w:r>
-        <w:rPr>
-          <w:sz w:val="20"/>
-          <w:szCs w:val="20"/>
-        </w:rPr>
-        <w:t xml:space="preserve"> to refactor.</w:t>
+        <w:t xml:space="preserve">The system is covered by </w:t>
+      </w:r>
+      <w:del w:id="4" w:author="Claude" w:date="2026-07-06T00:00:00Z">
+        <w:r>
+          <w:rPr>
+            <w:sz w:val="20"/>
+            <w:szCs w:val="20"/>
+          </w:rPr>
+          <w:delText>207</w:delText>
+        </w:r>
+      </w:del>
+      <w:ins w:id="5" w:author="Claude" w:date="2026-07-06T00:00:00Z">
+        <w:r>
+          <w:rPr>
+            <w:sz w:val="20"/>
+            <w:szCs w:val="20"/>
+          </w:rPr>
+          <w:t>232</w:t>
+        </w:r>
+      </w:ins>
+      <w:r>
+        <w:rPr>
+          <w:sz w:val="20"/>
+          <w:szCs w:val="20"/>
+        </w:rPr>
+        <w:t xml:space="preserve"> automated tests, made up of </w:t>
+      </w:r>
+      <w:del w:id="6" w:author="Claude" w:date="2026-07-06T00:00:00Z">
+        <w:r>
+          <w:rPr>
+            <w:sz w:val="20"/>
+            <w:szCs w:val="20"/>
+          </w:rPr>
+          <w:delText>149</w:delText>
+        </w:r>
+      </w:del>
+      <w:ins w:id="7" w:author="Claude" w:date="2026-07-06T00:00:00Z">
+        <w:r>
+          <w:rPr>
+            <w:sz w:val="20"/>
+            <w:szCs w:val="20"/>
+          </w:rPr>
+          <w:t>164</w:t>
+        </w:r>
+      </w:ins>
+      <w:r>
+        <w:rPr>
+          <w:sz w:val="20"/>
+          <w:szCs w:val="20"/>
+        </w:rPr>
+        <w:t xml:space="preserve"> integration tests that drive the real HTTP routes against an in-memory database and </w:t>
+      </w:r>
+      <w:del w:id="8" w:author="Claude" w:date="2026-07-06T00:00:00Z">
+        <w:r>
+          <w:rPr>
+            <w:sz w:val="20"/>
+            <w:szCs w:val="20"/>
+          </w:rPr>
+          <w:delText>58</w:delText>
+        </w:r>
+      </w:del>
+      <w:ins w:id="9" w:author="Claude" w:date="2026-07-06T00:00:00Z">
+        <w:r>
+          <w:rPr>
+            <w:sz w:val="20"/>
+            <w:szCs w:val="20"/>
+          </w:rPr>
+          <w:t>68</w:t>
+        </w:r>
+      </w:ins>
+      <w:r>
+        <w:rPr>
+          <w:sz w:val="20"/>
+          <w:szCs w:val="20"/>
+        </w:rPr>
+        <w:t xml:space="preserve"> unit tests for pure logic such as overlap maths, gap finding, and PDF word wrapping. Every test runs with no external setup, which made regression checking fast and reliable throughout development and gave us the confidence to refactor.</w:t>
       </w:r>
     </w:p>
     <w:p>
@@ -3598,7 +3319,6 @@
                 <w:szCs w:val="18"/>
               </w:rPr>
             </w:pPr>
-            <w:proofErr w:type="gramStart"/>
             <w:r>
               <w:rPr>
                 <w:b/>
@@ -3609,7 +3329,6 @@
               </w:rPr>
               <w:t>Main focus</w:t>
             </w:r>
-            <w:proofErr w:type="gramEnd"/>
           </w:p>
         </w:tc>
       </w:tr>
@@ -3675,7 +3394,7 @@
                 <w:szCs w:val="18"/>
               </w:rPr>
             </w:pPr>
-            <w:del w:id="2" w:author="Claude" w:date="2026-07-05T00:00:00Z">
+            <w:del w:id="10" w:author="Claude" w:date="2026-07-05T00:00:00Z">
               <w:r>
                 <w:rPr>
                   <w:sz w:val="18"/>
@@ -3684,13 +3403,13 @@
                 <w:delText>56</w:delText>
               </w:r>
             </w:del>
-            <w:ins w:id="3" w:author="Claude" w:date="2026-07-05T00:00:00Z">
+            <w:ins w:id="11" w:author="Claude" w:date="2026-07-05T00:00:00Z">
               <w:r>
                 <w:rPr>
                   <w:sz w:val="18"/>
                   <w:szCs w:val="18"/>
                 </w:rPr>
-                <w:t>58</w:t>
+                <w:t>68</w:t>
               </w:r>
             </w:ins>
           </w:p>
@@ -3900,13 +3619,24 @@
                 <w:szCs w:val="18"/>
               </w:rPr>
             </w:pPr>
-            <w:r>
-              <w:rPr>
-                <w:sz w:val="18"/>
-                <w:szCs w:val="18"/>
-              </w:rPr>
-              <w:t>20</w:t>
-            </w:r>
+            <w:del w:id="12" w:author="Claude" w:date="2026-07-06T00:00:00Z">
+              <w:r>
+                <w:rPr>
+                  <w:sz w:val="18"/>
+                  <w:szCs w:val="18"/>
+                </w:rPr>
+                <w:delText>20</w:delText>
+              </w:r>
+            </w:del>
+            <w:ins w:id="13" w:author="Claude" w:date="2026-07-06T00:00:00Z">
+              <w:r>
+                <w:rPr>
+                  <w:sz w:val="18"/>
+                  <w:szCs w:val="18"/>
+                </w:rPr>
+                <w:t>29</w:t>
+              </w:r>
+            </w:ins>
           </w:p>
         </w:tc>
         <w:tc>
@@ -4007,7 +3737,7 @@
                 <w:szCs w:val="18"/>
               </w:rPr>
             </w:pPr>
-            <w:del w:id="4" w:author="Claude" w:date="2026-07-05T00:00:00Z">
+            <w:del w:id="14" w:author="Claude" w:date="2026-07-05T00:00:00Z">
               <w:r>
                 <w:rPr>
                   <w:sz w:val="18"/>
@@ -4016,13 +3746,13 @@
                 <w:delText>30</w:delText>
               </w:r>
             </w:del>
-            <w:ins w:id="5" w:author="Claude" w:date="2026-07-05T00:00:00Z">
+            <w:ins w:id="15" w:author="Claude" w:date="2026-07-05T00:00:00Z">
               <w:r>
                 <w:rPr>
                   <w:sz w:val="18"/>
                   <w:szCs w:val="18"/>
                 </w:rPr>
-                <w:t>35</w:t>
+                <w:t>38</w:t>
               </w:r>
             </w:ins>
           </w:p>
@@ -4053,24 +3783,13 @@
                 <w:szCs w:val="18"/>
               </w:rPr>
             </w:pPr>
-            <w:del w:id="6" w:author="Claude" w:date="2026-07-05T00:00:00Z">
-              <w:r>
-                <w:rPr>
-                  <w:sz w:val="18"/>
-                  <w:szCs w:val="18"/>
-                </w:rPr>
-                <w:delText>Booking, priority booking, cancellation, and waitlist over HTTP.</w:delText>
-              </w:r>
-            </w:del>
-            <w:ins w:id="7" w:author="Claude" w:date="2026-07-05T00:00:00Z">
-              <w:r>
-                <w:rPr>
-                  <w:sz w:val="18"/>
-                  <w:szCs w:val="18"/>
-                </w:rPr>
-                <w:t>Booking, priority booking, cancellation, and waitlist over HTTP, including the auto‑reschedule‑on‑bump and expiry lifecycle.</w:t>
-              </w:r>
-            </w:ins>
+            <w:r>
+              <w:rPr>
+                <w:sz w:val="18"/>
+                <w:szCs w:val="18"/>
+              </w:rPr>
+              <w:t>Booking, priority booking, cancellation, and waitlist over HTTP, including the auto‑reschedule‑on‑bump and expiry lifecycle.</w:t>
+            </w:r>
           </w:p>
         </w:tc>
       </w:tr>
@@ -4243,13 +3962,24 @@
                 <w:szCs w:val="18"/>
               </w:rPr>
             </w:pPr>
-            <w:r>
-              <w:rPr>
-                <w:sz w:val="18"/>
-                <w:szCs w:val="18"/>
-              </w:rPr>
-              <w:t>13</w:t>
-            </w:r>
+            <w:del w:id="16" w:author="Claude" w:date="2026-07-06T00:00:00Z">
+              <w:r>
+                <w:rPr>
+                  <w:sz w:val="18"/>
+                  <w:szCs w:val="18"/>
+                </w:rPr>
+                <w:delText>13</w:delText>
+              </w:r>
+            </w:del>
+            <w:ins w:id="17" w:author="Claude" w:date="2026-07-06T00:00:00Z">
+              <w:r>
+                <w:rPr>
+                  <w:sz w:val="18"/>
+                  <w:szCs w:val="18"/>
+                </w:rPr>
+                <w:t>16</w:t>
+              </w:r>
+            </w:ins>
           </w:p>
         </w:tc>
         <w:tc>
@@ -4350,13 +4080,24 @@
                 <w:szCs w:val="18"/>
               </w:rPr>
             </w:pPr>
-            <w:r>
-              <w:rPr>
-                <w:sz w:val="18"/>
-                <w:szCs w:val="18"/>
-              </w:rPr>
-              <w:t>3</w:t>
-            </w:r>
+            <w:del w:id="18" w:author="Claude" w:date="2026-07-06T00:00:00Z">
+              <w:r>
+                <w:rPr>
+                  <w:sz w:val="18"/>
+                  <w:szCs w:val="18"/>
+                </w:rPr>
+                <w:delText>3</w:delText>
+              </w:r>
+            </w:del>
+            <w:ins w:id="19" w:author="Claude" w:date="2026-07-06T00:00:00Z">
+              <w:r>
+                <w:rPr>
+                  <w:sz w:val="18"/>
+                  <w:szCs w:val="18"/>
+                </w:rPr>
+                <w:t>12</w:t>
+              </w:r>
+            </w:ins>
           </w:p>
         </w:tc>
         <w:tc>
@@ -4457,13 +4198,24 @@
                 <w:szCs w:val="18"/>
               </w:rPr>
             </w:pPr>
-            <w:r>
-              <w:rPr>
-                <w:sz w:val="18"/>
-                <w:szCs w:val="18"/>
-              </w:rPr>
-              <w:t>4</w:t>
-            </w:r>
+            <w:del w:id="20" w:author="Claude" w:date="2026-07-06T00:00:00Z">
+              <w:r>
+                <w:rPr>
+                  <w:sz w:val="18"/>
+                  <w:szCs w:val="18"/>
+                </w:rPr>
+                <w:delText>4</w:delText>
+              </w:r>
+            </w:del>
+            <w:ins w:id="21" w:author="Claude" w:date="2026-07-06T00:00:00Z">
+              <w:r>
+                <w:rPr>
+                  <w:sz w:val="18"/>
+                  <w:szCs w:val="18"/>
+                </w:rPr>
+                <w:t>7</w:t>
+              </w:r>
+            </w:ins>
           </w:p>
         </w:tc>
         <w:tc>
@@ -4526,55 +4278,7 @@
           <w:sz w:val="20"/>
           <w:szCs w:val="20"/>
         </w:rPr>
-        <w:t xml:space="preserve">Building the system reinforced one lesson: guarantees that </w:t>
-      </w:r>
-      <w:proofErr w:type="gramStart"/>
-      <w:r>
-        <w:rPr>
-          <w:sz w:val="20"/>
-          <w:szCs w:val="20"/>
-        </w:rPr>
-        <w:t>last are the</w:t>
-      </w:r>
-      <w:proofErr w:type="gramEnd"/>
-      <w:r>
-        <w:rPr>
-          <w:sz w:val="20"/>
-          <w:szCs w:val="20"/>
-        </w:rPr>
-        <w:t xml:space="preserve"> ones </w:t>
-      </w:r>
-      <w:proofErr w:type="gramStart"/>
-      <w:r>
-        <w:rPr>
-          <w:sz w:val="20"/>
-          <w:szCs w:val="20"/>
-        </w:rPr>
-        <w:t>pushed</w:t>
-      </w:r>
-      <w:proofErr w:type="gramEnd"/>
-      <w:r>
-        <w:rPr>
-          <w:sz w:val="20"/>
-          <w:szCs w:val="20"/>
-        </w:rPr>
-        <w:t xml:space="preserve"> into the type system or the database, not careful handler-level code where edge cases and races eventually slip through. That is true of the unique index that makes double booking impossible, the typed role enum that turns an unhandled privilege into a compile error, and the transaction that rolls back a half-finished priority override by itself. Extending the project with email notifications for waitlist offers or a calendar export would follow the same principle behind the existing service layer. In conclusion, the system delivers a clinic management portal built around a reliable scheduling engine, database-enforced concurrency, and distinct extended modules with real operational depth: reliable, easy to extend, and faithful to how a clinic </w:t>
-      </w:r>
-      <w:proofErr w:type="gramStart"/>
-      <w:r>
-        <w:rPr>
-          <w:sz w:val="20"/>
-          <w:szCs w:val="20"/>
-        </w:rPr>
-        <w:t>actually operates</w:t>
-      </w:r>
-      <w:proofErr w:type="gramEnd"/>
-      <w:r>
-        <w:rPr>
-          <w:sz w:val="20"/>
-          <w:szCs w:val="20"/>
-        </w:rPr>
-        <w:t>.</w:t>
+        <w:t>Building the system reinforced one lesson: guarantees that last are the ones pushed into the type system or the database, not careful handler-level code where edge cases and races eventually slip through. That is true of the unique index that makes double booking impossible, the typed role enum that turns an unhandled privilege into a compile error, and the transaction that rolls back a half-finished priority override by itself. Extending the project with email notifications for waitlist offers or a calendar export would follow the same principle behind the existing service layer. In conclusion, the system delivers a clinic management portal built around a reliable scheduling engine, database-enforced concurrency, and distinct extended modules with real operational depth: reliable, easy to extend, and faithful to how a clinic actually operates.</w:t>
       </w:r>
     </w:p>
     <w:sectPr>

</xml_diff>